<commit_message>
Agregar informe final y actualizar bitacora de IA
</commit_message>
<xml_diff>
--- a/Bitacora_IA_ISW612.docx
+++ b/Bitacora_IA_ISW612.docx
@@ -1,6 +1,6 @@
 
 <file path=word/document.xml><?xml version="1.0" encoding="utf-8"?>
-<w:document xmlns:wpc="http://schemas.microsoft.com/office/word/2010/wordprocessingCanvas" xmlns:cx="http://schemas.microsoft.com/office/drawing/2014/chartex" xmlns:cx1="http://schemas.microsoft.com/office/drawing/2015/9/8/chartex" xmlns:cx2="http://schemas.microsoft.com/office/drawing/2015/10/21/chartex" xmlns:cx3="http://schemas.microsoft.com/office/drawing/2016/5/9/chartex" xmlns:cx4="http://schemas.microsoft.com/office/drawing/2016/5/10/chartex" xmlns:cx5="http://schemas.microsoft.com/office/drawing/2016/5/11/chartex" xmlns:cx6="http://schemas.microsoft.com/office/drawing/2016/5/12/chartex" xmlns:cx7="http://schemas.microsoft.com/office/drawing/2016/5/13/chartex" xmlns:cx8="http://schemas.microsoft.com/office/drawing/2016/5/14/chartex" xmlns:mc="http://schemas.openxmlformats.org/markup-compatibility/2006" xmlns:aink="http://schemas.microsoft.com/office/drawing/2016/ink" xmlns:am3d="http://schemas.microsoft.com/office/drawing/2017/model3d" xmlns:o="urn:schemas-microsoft-com:office:office" xmlns:r="http://schemas.openxmlformats.org/officeDocument/2006/relationships" xmlns:m="http://schemas.openxmlformats.org/officeDocument/2006/math" xmlns:v="urn:schemas-microsoft-com:vml" xmlns:wp14="http://schemas.microsoft.com/office/word/2010/wordprocessingDrawing" xmlns:wp="http://schemas.openxmlformats.org/drawingml/2006/wordprocessingDrawing" xmlns:w10="urn:schemas-microsoft-com:office:word" xmlns:w="http://schemas.openxmlformats.org/wordprocessingml/2006/main" xmlns:w14="http://schemas.microsoft.com/office/word/2010/wordml" xmlns:w15="http://schemas.microsoft.com/office/word/2012/wordml" xmlns:w16cex="http://schemas.microsoft.com/office/word/2018/wordml/cex" xmlns:w16cid="http://schemas.microsoft.com/office/word/2016/wordml/cid" xmlns:w16="http://schemas.microsoft.com/office/word/2018/wordml" xmlns:w16sdtdh="http://schemas.microsoft.com/office/word/2020/wordml/sdtdatahash" xmlns:w16se="http://schemas.microsoft.com/office/word/2015/wordml/symex" xmlns:wpg="http://schemas.microsoft.com/office/word/2010/wordprocessingGroup" xmlns:wpi="http://schemas.microsoft.com/office/word/2010/wordprocessingInk" xmlns:wne="http://schemas.microsoft.com/office/word/2006/wordml" xmlns:wps="http://schemas.microsoft.com/office/word/2010/wordprocessingShape" mc:Ignorable="w14 w15 w16se w16cid w16 w16cex w16sdtdh wp14">
+<w:document xmlns:wpc="http://schemas.microsoft.com/office/word/2010/wordprocessingCanvas" xmlns:cx="http://schemas.microsoft.com/office/drawing/2014/chartex" xmlns:cx1="http://schemas.microsoft.com/office/drawing/2015/9/8/chartex" xmlns:cx2="http://schemas.microsoft.com/office/drawing/2015/10/21/chartex" xmlns:cx3="http://schemas.microsoft.com/office/drawing/2016/5/9/chartex" xmlns:cx4="http://schemas.microsoft.com/office/drawing/2016/5/10/chartex" xmlns:cx5="http://schemas.microsoft.com/office/drawing/2016/5/11/chartex" xmlns:cx6="http://schemas.microsoft.com/office/drawing/2016/5/12/chartex" xmlns:cx7="http://schemas.microsoft.com/office/drawing/2016/5/13/chartex" xmlns:cx8="http://schemas.microsoft.com/office/drawing/2016/5/14/chartex" xmlns:mc="http://schemas.openxmlformats.org/markup-compatibility/2006" xmlns:aink="http://schemas.microsoft.com/office/drawing/2016/ink" xmlns:am3d="http://schemas.microsoft.com/office/drawing/2017/model3d" xmlns:o="urn:schemas-microsoft-com:office:office" xmlns:oel="http://schemas.microsoft.com/office/2019/extlst" xmlns:r="http://schemas.openxmlformats.org/officeDocument/2006/relationships" xmlns:m="http://schemas.openxmlformats.org/officeDocument/2006/math" xmlns:v="urn:schemas-microsoft-com:vml" xmlns:wp14="http://schemas.microsoft.com/office/word/2010/wordprocessingDrawing" xmlns:wp="http://schemas.openxmlformats.org/drawingml/2006/wordprocessingDrawing" xmlns:w10="urn:schemas-microsoft-com:office:word" xmlns:w="http://schemas.openxmlformats.org/wordprocessingml/2006/main" xmlns:w14="http://schemas.microsoft.com/office/word/2010/wordml" xmlns:w15="http://schemas.microsoft.com/office/word/2012/wordml" xmlns:w16cex="http://schemas.microsoft.com/office/word/2018/wordml/cex" xmlns:w16cid="http://schemas.microsoft.com/office/word/2016/wordml/cid" xmlns:w16="http://schemas.microsoft.com/office/word/2018/wordml" xmlns:w16du="http://schemas.microsoft.com/office/word/2023/wordml/word16du" xmlns:w16sdtdh="http://schemas.microsoft.com/office/word/2020/wordml/sdtdatahash" xmlns:w16sdtfl="http://schemas.microsoft.com/office/word/2024/wordml/sdtformatlock" xmlns:w16se="http://schemas.microsoft.com/office/word/2015/wordml/symex" xmlns:wpg="http://schemas.microsoft.com/office/word/2010/wordprocessingGroup" xmlns:wpi="http://schemas.microsoft.com/office/word/2010/wordprocessingInk" xmlns:wne="http://schemas.microsoft.com/office/word/2006/wordml" xmlns:wps="http://schemas.microsoft.com/office/word/2010/wordprocessingShape" mc:Ignorable="w14 w15 w16se w16cid w16 w16cex w16sdtdh w16sdtfl w16du wp14">
   <w:body>
     <w:p>
       <w:pPr>
@@ -84,12 +84,6 @@
         <w:gridCol w:w="6960"/>
       </w:tblGrid>
       <w:tr>
-        <w:tblPrEx>
-          <w:tblCellMar>
-            <w:top w:w="0" w:type="dxa"/>
-            <w:bottom w:w="0" w:type="dxa"/>
-          </w:tblCellMar>
-        </w:tblPrEx>
         <w:tc>
           <w:tcPr>
             <w:tcW w:w="2400" w:type="dxa"/>
@@ -141,12 +135,6 @@
         </w:tc>
       </w:tr>
       <w:tr>
-        <w:tblPrEx>
-          <w:tblCellMar>
-            <w:top w:w="0" w:type="dxa"/>
-            <w:bottom w:w="0" w:type="dxa"/>
-          </w:tblCellMar>
-        </w:tblPrEx>
         <w:tc>
           <w:tcPr>
             <w:tcW w:w="2400" w:type="dxa"/>
@@ -200,12 +188,6 @@
         </w:tc>
       </w:tr>
       <w:tr>
-        <w:tblPrEx>
-          <w:tblCellMar>
-            <w:top w:w="0" w:type="dxa"/>
-            <w:bottom w:w="0" w:type="dxa"/>
-          </w:tblCellMar>
-        </w:tblPrEx>
         <w:tc>
           <w:tcPr>
             <w:tcW w:w="2400" w:type="dxa"/>
@@ -259,12 +241,6 @@
         </w:tc>
       </w:tr>
       <w:tr>
-        <w:tblPrEx>
-          <w:tblCellMar>
-            <w:top w:w="0" w:type="dxa"/>
-            <w:bottom w:w="0" w:type="dxa"/>
-          </w:tblCellMar>
-        </w:tblPrEx>
         <w:tc>
           <w:tcPr>
             <w:tcW w:w="2400" w:type="dxa"/>
@@ -316,12 +292,6 @@
         </w:tc>
       </w:tr>
       <w:tr>
-        <w:tblPrEx>
-          <w:tblCellMar>
-            <w:top w:w="0" w:type="dxa"/>
-            <w:bottom w:w="0" w:type="dxa"/>
-          </w:tblCellMar>
-        </w:tblPrEx>
         <w:tc>
           <w:tcPr>
             <w:tcW w:w="2400" w:type="dxa"/>
@@ -373,43 +343,30 @@
         </w:tc>
       </w:tr>
       <w:tr>
-        <w:tblPrEx>
-          <w:tblCellMar>
-            <w:top w:w="0" w:type="dxa"/>
-            <w:bottom w:w="0" w:type="dxa"/>
-          </w:tblCellMar>
-        </w:tblPrEx>
-        <w:tc>
-          <w:tcPr>
-            <w:tcW w:w="2400" w:type="dxa"/>
-            <w:tcBorders>
-              <w:top w:val="single" w:sz="4" w:space="0" w:color="BFBFBF"/>
-              <w:left w:val="single" w:sz="4" w:space="0" w:color="BFBFBF"/>
-              <w:bottom w:val="single" w:sz="4" w:space="0" w:color="BFBFBF"/>
-              <w:right w:val="single" w:sz="4" w:space="0" w:color="BFBFBF"/>
-            </w:tcBorders>
-            <w:shd w:val="clear" w:color="auto" w:fill="EAF0F8"/>
-            <w:tcMar>
-              <w:top w:w="80" w:type="dxa"/>
-              <w:left w:w="120" w:type="dxa"/>
-              <w:bottom w:w="80" w:type="dxa"/>
-              <w:right w:w="120" w:type="dxa"/>
-            </w:tcMar>
-          </w:tcPr>
-          <w:p>
-            <w:r>
-              <w:rPr>
-                <w:b/>
-                <w:bCs/>
-              </w:rPr>
-              <w:t>Qué corrigieron o descartar</w:t>
-            </w:r>
-            <w:r>
-              <w:rPr>
-                <w:b/>
-                <w:bCs/>
-              </w:rPr>
-              <w:t>on</w:t>
+        <w:tc>
+          <w:tcPr>
+            <w:tcW w:w="2400" w:type="dxa"/>
+            <w:tcBorders>
+              <w:top w:val="single" w:sz="4" w:space="0" w:color="BFBFBF"/>
+              <w:left w:val="single" w:sz="4" w:space="0" w:color="BFBFBF"/>
+              <w:bottom w:val="single" w:sz="4" w:space="0" w:color="BFBFBF"/>
+              <w:right w:val="single" w:sz="4" w:space="0" w:color="BFBFBF"/>
+            </w:tcBorders>
+            <w:shd w:val="clear" w:color="auto" w:fill="EAF0F8"/>
+            <w:tcMar>
+              <w:top w:w="80" w:type="dxa"/>
+              <w:left w:w="120" w:type="dxa"/>
+              <w:bottom w:w="80" w:type="dxa"/>
+              <w:right w:w="120" w:type="dxa"/>
+            </w:tcMar>
+          </w:tcPr>
+          <w:p>
+            <w:r>
+              <w:rPr>
+                <w:b/>
+                <w:bCs/>
+              </w:rPr>
+              <w:t>Qué corrigieron o descartaron</w:t>
             </w:r>
           </w:p>
         </w:tc>
@@ -437,12 +394,6 @@
         </w:tc>
       </w:tr>
       <w:tr>
-        <w:tblPrEx>
-          <w:tblCellMar>
-            <w:top w:w="0" w:type="dxa"/>
-            <w:bottom w:w="0" w:type="dxa"/>
-          </w:tblCellMar>
-        </w:tblPrEx>
         <w:tc>
           <w:tcPr>
             <w:tcW w:w="2400" w:type="dxa"/>
@@ -636,12 +587,6 @@
         <w:gridCol w:w="6960"/>
       </w:tblGrid>
       <w:tr>
-        <w:tblPrEx>
-          <w:tblCellMar>
-            <w:top w:w="0" w:type="dxa"/>
-            <w:bottom w:w="0" w:type="dxa"/>
-          </w:tblCellMar>
-        </w:tblPrEx>
         <w:tc>
           <w:tcPr>
             <w:tcW w:w="2400" w:type="dxa"/>
@@ -694,12 +639,6 @@
         </w:tc>
       </w:tr>
       <w:tr>
-        <w:tblPrEx>
-          <w:tblCellMar>
-            <w:top w:w="0" w:type="dxa"/>
-            <w:bottom w:w="0" w:type="dxa"/>
-          </w:tblCellMar>
-        </w:tblPrEx>
         <w:tc>
           <w:tcPr>
             <w:tcW w:w="2400" w:type="dxa"/>
@@ -751,12 +690,6 @@
         </w:tc>
       </w:tr>
       <w:tr>
-        <w:tblPrEx>
-          <w:tblCellMar>
-            <w:top w:w="0" w:type="dxa"/>
-            <w:bottom w:w="0" w:type="dxa"/>
-          </w:tblCellMar>
-        </w:tblPrEx>
         <w:tc>
           <w:tcPr>
             <w:tcW w:w="2400" w:type="dxa"/>
@@ -810,12 +743,6 @@
         </w:tc>
       </w:tr>
       <w:tr>
-        <w:tblPrEx>
-          <w:tblCellMar>
-            <w:top w:w="0" w:type="dxa"/>
-            <w:bottom w:w="0" w:type="dxa"/>
-          </w:tblCellMar>
-        </w:tblPrEx>
         <w:tc>
           <w:tcPr>
             <w:tcW w:w="2400" w:type="dxa"/>
@@ -865,11 +792,11 @@
             </w:r>
             <w:proofErr w:type="spellStart"/>
             <w:r>
-              <w:t>Get-Process</w:t>
+              <w:t>Get</w:t>
             </w:r>
             <w:proofErr w:type="spellEnd"/>
             <w:r>
-              <w:t xml:space="preserve">, reglas R1 y R2, consulta de </w:t>
+              <w:t xml:space="preserve">-Process, reglas R1 y R2, consulta de </w:t>
             </w:r>
             <w:proofErr w:type="spellStart"/>
             <w:r>
@@ -883,12 +810,6 @@
         </w:tc>
       </w:tr>
       <w:tr>
-        <w:tblPrEx>
-          <w:tblCellMar>
-            <w:top w:w="0" w:type="dxa"/>
-            <w:bottom w:w="0" w:type="dxa"/>
-          </w:tblCellMar>
-        </w:tblPrEx>
         <w:tc>
           <w:tcPr>
             <w:tcW w:w="2400" w:type="dxa"/>
@@ -996,12 +917,6 @@
         </w:tc>
       </w:tr>
       <w:tr>
-        <w:tblPrEx>
-          <w:tblCellMar>
-            <w:top w:w="0" w:type="dxa"/>
-            <w:bottom w:w="0" w:type="dxa"/>
-          </w:tblCellMar>
-        </w:tblPrEx>
         <w:tc>
           <w:tcPr>
             <w:tcW w:w="2400" w:type="dxa"/>
@@ -1080,12 +995,6 @@
         </w:tc>
       </w:tr>
       <w:tr>
-        <w:tblPrEx>
-          <w:tblCellMar>
-            <w:top w:w="0" w:type="dxa"/>
-            <w:bottom w:w="0" w:type="dxa"/>
-          </w:tblCellMar>
-        </w:tblPrEx>
         <w:tc>
           <w:tcPr>
             <w:tcW w:w="2400" w:type="dxa"/>
@@ -1139,21 +1048,12 @@
             </w:r>
             <w:proofErr w:type="spellEnd"/>
             <w:r>
-              <w:t xml:space="preserve"> set, porque este último sube y baja según lo que Windows decide mantener en RAM. </w:t>
-            </w:r>
-            <w:r>
-              <w:t>También aprendimos que la ayuda por IA puede funcionar en lo principal y aun así fallar en detalles como la codificación por ende se tiene que revisar meticulosamente</w:t>
-            </w:r>
-          </w:p>
-        </w:tc>
-      </w:tr>
-      <w:tr>
-        <w:tblPrEx>
-          <w:tblCellMar>
-            <w:top w:w="0" w:type="dxa"/>
-            <w:bottom w:w="0" w:type="dxa"/>
-          </w:tblCellMar>
-        </w:tblPrEx>
+              <w:t xml:space="preserve"> set, porque este último sube y baja según lo que Windows decide mantener en RAM. También aprendimos que la ayuda por IA puede funcionar en lo principal y aun así fallar en detalles como la codificación por ende se tiene que revisar meticulosamente</w:t>
+            </w:r>
+          </w:p>
+        </w:tc>
+      </w:tr>
+      <w:tr>
         <w:tc>
           <w:tcPr>
             <w:tcW w:w="2400" w:type="dxa"/>
@@ -1223,31 +1123,15 @@
             </w:r>
             <w:proofErr w:type="spellEnd"/>
             <w:r>
-              <w:t xml:space="preserve"> </w:t>
+              <w:t xml:space="preserve"> Guard inactivo. Con esto, la parte de la hipótesis H2 que esperaba encontrar alguna protección inactiva se cumplió solo para </w:t>
             </w:r>
             <w:proofErr w:type="spellStart"/>
             <w:r>
-              <w:t>Guard</w:t>
+              <w:t>Credential</w:t>
             </w:r>
             <w:proofErr w:type="spellEnd"/>
             <w:r>
-              <w:t xml:space="preserve"> inactivo. Con esto, la parte de la hipótesis H2 que esperaba encontrar alguna protección inactiva se cumplió solo para </w:t>
-            </w:r>
-            <w:proofErr w:type="spellStart"/>
-            <w:r>
-              <w:t>Credential</w:t>
-            </w:r>
-            <w:proofErr w:type="spellEnd"/>
-            <w:r>
-              <w:t xml:space="preserve"> </w:t>
-            </w:r>
-            <w:proofErr w:type="spellStart"/>
-            <w:r>
-              <w:t>Guard</w:t>
-            </w:r>
-            <w:proofErr w:type="spellEnd"/>
-            <w:r>
-              <w:t xml:space="preserve">; LSA </w:t>
+              <w:t xml:space="preserve"> Guard; LSA </w:t>
             </w:r>
             <w:proofErr w:type="spellStart"/>
             <w:r>
@@ -1266,6 +1150,7 @@
         <w:pageBreakBefore/>
       </w:pPr>
     </w:p>
+    <w:p/>
     <w:p>
       <w:pPr>
         <w:pStyle w:val="Ttulo2"/>
@@ -1279,7 +1164,27 @@
           <w:sz w:val="28"/>
           <w:szCs w:val="28"/>
         </w:rPr>
-        <w:t>Entrada 3 (plantilla)</w:t>
+        <w:t xml:space="preserve">Entrada </w:t>
+      </w:r>
+      <w:r>
+        <w:rPr>
+          <w:b/>
+          <w:bCs/>
+          <w:color w:val="1F3864"/>
+          <w:sz w:val="28"/>
+          <w:szCs w:val="28"/>
+        </w:rPr>
+        <w:t>3</w:t>
+      </w:r>
+      <w:r>
+        <w:rPr>
+          <w:b/>
+          <w:bCs/>
+          <w:color w:val="1F3864"/>
+          <w:sz w:val="28"/>
+          <w:szCs w:val="28"/>
+        </w:rPr>
+        <w:t xml:space="preserve"> </w:t>
       </w:r>
     </w:p>
     <w:tbl>
@@ -1304,12 +1209,6 @@
         <w:gridCol w:w="6960"/>
       </w:tblGrid>
       <w:tr>
-        <w:tblPrEx>
-          <w:tblCellMar>
-            <w:top w:w="0" w:type="dxa"/>
-            <w:bottom w:w="0" w:type="dxa"/>
-          </w:tblCellMar>
-        </w:tblPrEx>
         <w:tc>
           <w:tcPr>
             <w:tcW w:w="2400" w:type="dxa"/>
@@ -1353,16 +1252,22 @@
               <w:right w:w="120" w:type="dxa"/>
             </w:tcMar>
           </w:tcPr>
-          <w:p/>
-        </w:tc>
-      </w:tr>
-      <w:tr>
-        <w:tblPrEx>
-          <w:tblCellMar>
-            <w:top w:w="0" w:type="dxa"/>
-            <w:bottom w:w="0" w:type="dxa"/>
-          </w:tblCellMar>
-        </w:tblPrEx>
+          <w:p>
+            <w:pPr>
+              <w:rPr>
+                <w:lang w:val="es-CR"/>
+              </w:rPr>
+            </w:pPr>
+            <w:r>
+              <w:rPr>
+                <w:lang w:val="es-CR"/>
+              </w:rPr>
+              <w:t>23/10/2026</w:t>
+            </w:r>
+          </w:p>
+        </w:tc>
+      </w:tr>
+      <w:tr>
         <w:tc>
           <w:tcPr>
             <w:tcW w:w="2400" w:type="dxa"/>
@@ -1406,36 +1311,36 @@
               <w:right w:w="120" w:type="dxa"/>
             </w:tcMar>
           </w:tcPr>
-          <w:p/>
-        </w:tc>
-      </w:tr>
-      <w:tr>
-        <w:tblPrEx>
-          <w:tblCellMar>
-            <w:top w:w="0" w:type="dxa"/>
-            <w:bottom w:w="0" w:type="dxa"/>
-          </w:tblCellMar>
-        </w:tblPrEx>
-        <w:tc>
-          <w:tcPr>
-            <w:tcW w:w="2400" w:type="dxa"/>
-            <w:tcBorders>
-              <w:top w:val="single" w:sz="4" w:space="0" w:color="BFBFBF"/>
-              <w:left w:val="single" w:sz="4" w:space="0" w:color="BFBFBF"/>
-              <w:bottom w:val="single" w:sz="4" w:space="0" w:color="BFBFBF"/>
-              <w:right w:val="single" w:sz="4" w:space="0" w:color="BFBFBF"/>
-            </w:tcBorders>
-            <w:shd w:val="clear" w:color="auto" w:fill="EAF0F8"/>
-            <w:tcMar>
-              <w:top w:w="80" w:type="dxa"/>
-              <w:left w:w="120" w:type="dxa"/>
-              <w:bottom w:w="80" w:type="dxa"/>
-              <w:right w:w="120" w:type="dxa"/>
-            </w:tcMar>
-          </w:tcPr>
           <w:p>
             <w:proofErr w:type="spellStart"/>
             <w:r>
+              <w:t>ChatGPT</w:t>
+            </w:r>
+            <w:proofErr w:type="spellEnd"/>
+          </w:p>
+        </w:tc>
+      </w:tr>
+      <w:tr>
+        <w:tc>
+          <w:tcPr>
+            <w:tcW w:w="2400" w:type="dxa"/>
+            <w:tcBorders>
+              <w:top w:val="single" w:sz="4" w:space="0" w:color="BFBFBF"/>
+              <w:left w:val="single" w:sz="4" w:space="0" w:color="BFBFBF"/>
+              <w:bottom w:val="single" w:sz="4" w:space="0" w:color="BFBFBF"/>
+              <w:right w:val="single" w:sz="4" w:space="0" w:color="BFBFBF"/>
+            </w:tcBorders>
+            <w:shd w:val="clear" w:color="auto" w:fill="EAF0F8"/>
+            <w:tcMar>
+              <w:top w:w="80" w:type="dxa"/>
+              <w:left w:w="120" w:type="dxa"/>
+              <w:bottom w:w="80" w:type="dxa"/>
+              <w:right w:w="120" w:type="dxa"/>
+            </w:tcMar>
+          </w:tcPr>
+          <w:p>
+            <w:proofErr w:type="spellStart"/>
+            <w:r>
               <w:rPr>
                 <w:b/>
                 <w:bCs/>
@@ -1461,16 +1366,22 @@
               <w:right w:w="120" w:type="dxa"/>
             </w:tcMar>
           </w:tcPr>
-          <w:p/>
-        </w:tc>
-      </w:tr>
-      <w:tr>
-        <w:tblPrEx>
-          <w:tblCellMar>
-            <w:top w:w="0" w:type="dxa"/>
-            <w:bottom w:w="0" w:type="dxa"/>
-          </w:tblCellMar>
-        </w:tblPrEx>
+          <w:p>
+            <w:pPr>
+              <w:rPr>
+                <w:lang w:val="es-CR"/>
+              </w:rPr>
+            </w:pPr>
+            <w:r>
+              <w:rPr>
+                <w:lang w:val="es-CR"/>
+              </w:rPr>
+              <w:t>Se pidió ayuda para desarrollar una aplicación web que pudiera cargar los datos JSON del monitor de PowerShell y mostrar los resultados de manera sencilla.</w:t>
+            </w:r>
+          </w:p>
+        </w:tc>
+      </w:tr>
+      <w:tr>
         <w:tc>
           <w:tcPr>
             <w:tcW w:w="2400" w:type="dxa"/>
@@ -1514,16 +1425,58 @@
               <w:right w:w="120" w:type="dxa"/>
             </w:tcMar>
           </w:tcPr>
-          <w:p/>
-        </w:tc>
-      </w:tr>
-      <w:tr>
-        <w:tblPrEx>
-          <w:tblCellMar>
-            <w:top w:w="0" w:type="dxa"/>
-            <w:bottom w:w="0" w:type="dxa"/>
-          </w:tblCellMar>
-        </w:tblPrEx>
+          <w:p>
+            <w:pPr>
+              <w:rPr>
+                <w:lang w:val="es-CR"/>
+              </w:rPr>
+            </w:pPr>
+            <w:proofErr w:type="spellStart"/>
+            <w:r>
+              <w:rPr>
+                <w:lang w:val="es-CR"/>
+              </w:rPr>
+              <w:t>ChatGPT</w:t>
+            </w:r>
+            <w:proofErr w:type="spellEnd"/>
+            <w:r>
+              <w:rPr>
+                <w:lang w:val="es-CR"/>
+              </w:rPr>
+              <w:t xml:space="preserve"> proporcionó código HTML, CSS y JavaScript para crear la página. Se agregaron funciones para cargar archivos JSON, mostrar un resumen, generar gráficos de memoria, consultar las alertas y visualizar el estado de LSA </w:t>
+            </w:r>
+            <w:proofErr w:type="spellStart"/>
+            <w:r>
+              <w:rPr>
+                <w:lang w:val="es-CR"/>
+              </w:rPr>
+              <w:t>Protection</w:t>
+            </w:r>
+            <w:proofErr w:type="spellEnd"/>
+            <w:r>
+              <w:rPr>
+                <w:lang w:val="es-CR"/>
+              </w:rPr>
+              <w:t xml:space="preserve"> y </w:t>
+            </w:r>
+            <w:proofErr w:type="spellStart"/>
+            <w:r>
+              <w:rPr>
+                <w:lang w:val="es-CR"/>
+              </w:rPr>
+              <w:t>Credential</w:t>
+            </w:r>
+            <w:proofErr w:type="spellEnd"/>
+            <w:r>
+              <w:rPr>
+                <w:lang w:val="es-CR"/>
+              </w:rPr>
+              <w:t xml:space="preserve"> Guard.</w:t>
+            </w:r>
+          </w:p>
+        </w:tc>
+      </w:tr>
+      <w:tr>
         <w:tc>
           <w:tcPr>
             <w:tcW w:w="2400" w:type="dxa"/>
@@ -1567,16 +1520,36 @@
               <w:right w:w="120" w:type="dxa"/>
             </w:tcMar>
           </w:tcPr>
-          <w:p/>
-        </w:tc>
-      </w:tr>
-      <w:tr>
-        <w:tblPrEx>
-          <w:tblCellMar>
-            <w:top w:w="0" w:type="dxa"/>
-            <w:bottom w:w="0" w:type="dxa"/>
-          </w:tblCellMar>
-        </w:tblPrEx>
+          <w:p>
+            <w:pPr>
+              <w:rPr>
+                <w:lang w:val="es-CR"/>
+              </w:rPr>
+            </w:pPr>
+            <w:r>
+              <w:rPr>
+                <w:lang w:val="es-CR"/>
+              </w:rPr>
+              <w:t>Se abrió la aplicación en Google Chrome y se utilizó el archivo Datos/</w:t>
+            </w:r>
+            <w:proofErr w:type="spellStart"/>
+            <w:r>
+              <w:rPr>
+                <w:lang w:val="es-CR"/>
+              </w:rPr>
+              <w:t>ejemplo.json</w:t>
+            </w:r>
+            <w:proofErr w:type="spellEnd"/>
+            <w:r>
+              <w:rPr>
+                <w:lang w:val="es-CR"/>
+              </w:rPr>
+              <w:t>. Comprobamos que se mostraran las 3184 muestras, la alerta original y el estado de las protecciones. También revisamos que los gráficos utilizaran las mediciones reales del JSON.</w:t>
+            </w:r>
+          </w:p>
+        </w:tc>
+      </w:tr>
+      <w:tr>
         <w:tc>
           <w:tcPr>
             <w:tcW w:w="2400" w:type="dxa"/>
@@ -1620,16 +1593,22 @@
               <w:right w:w="120" w:type="dxa"/>
             </w:tcMar>
           </w:tcPr>
-          <w:p/>
-        </w:tc>
-      </w:tr>
-      <w:tr>
-        <w:tblPrEx>
-          <w:tblCellMar>
-            <w:top w:w="0" w:type="dxa"/>
-            <w:bottom w:w="0" w:type="dxa"/>
-          </w:tblCellMar>
-        </w:tblPrEx>
+          <w:p>
+            <w:pPr>
+              <w:rPr>
+                <w:lang w:val="es-CR"/>
+              </w:rPr>
+            </w:pPr>
+            <w:r>
+              <w:rPr>
+                <w:lang w:val="es-CR"/>
+              </w:rPr>
+              <w:t>Al principio el botón para cargar los datos de ejemplo abría una ventana para seleccionar archivos. Esto no cumplía con lo que pedía el profesor. Se corrigió creando ejemplo.js para que los datos se cargaran automáticamente con un solo clic. También eliminamos código antiguo que ya no se utilizaba.</w:t>
+            </w:r>
+          </w:p>
+        </w:tc>
+      </w:tr>
+      <w:tr>
         <w:tc>
           <w:tcPr>
             <w:tcW w:w="2400" w:type="dxa"/>
@@ -1673,10 +1652,1521 @@
               <w:right w:w="120" w:type="dxa"/>
             </w:tcMar>
           </w:tcPr>
-          <w:p/>
+          <w:p>
+            <w:pPr>
+              <w:rPr>
+                <w:lang w:val="es-CR"/>
+              </w:rPr>
+            </w:pPr>
+            <w:r>
+              <w:rPr>
+                <w:lang w:val="es-CR"/>
+              </w:rPr>
+              <w:t>Aprendimos cómo conectar un archivo JSON con una aplicación web. También comprendimos que no basta con que una página se vea bien. Sus funciones deben trabajar correctamente y cumplir con los requisitos del proyecto.</w:t>
+            </w:r>
+          </w:p>
         </w:tc>
       </w:tr>
     </w:tbl>
+    <w:p/>
+    <w:p>
+      <w:pPr>
+        <w:pStyle w:val="Ttulo2"/>
+        <w:spacing w:before="300" w:after="120"/>
+      </w:pPr>
+      <w:r>
+        <w:rPr>
+          <w:b/>
+          <w:bCs/>
+          <w:color w:val="1F3864"/>
+          <w:sz w:val="28"/>
+          <w:szCs w:val="28"/>
+        </w:rPr>
+        <w:t xml:space="preserve">Entrada </w:t>
+      </w:r>
+      <w:r>
+        <w:rPr>
+          <w:b/>
+          <w:bCs/>
+          <w:color w:val="1F3864"/>
+          <w:sz w:val="28"/>
+          <w:szCs w:val="28"/>
+        </w:rPr>
+        <w:t>4</w:t>
+      </w:r>
+      <w:r>
+        <w:rPr>
+          <w:b/>
+          <w:bCs/>
+          <w:color w:val="1F3864"/>
+          <w:sz w:val="28"/>
+          <w:szCs w:val="28"/>
+        </w:rPr>
+        <w:t xml:space="preserve"> </w:t>
+      </w:r>
+    </w:p>
+    <w:tbl>
+      <w:tblPr>
+        <w:tblW w:w="9360" w:type="dxa"/>
+        <w:tblBorders>
+          <w:top w:val="single" w:sz="4" w:space="0" w:color="auto"/>
+          <w:left w:val="single" w:sz="4" w:space="0" w:color="auto"/>
+          <w:bottom w:val="single" w:sz="4" w:space="0" w:color="auto"/>
+          <w:right w:val="single" w:sz="4" w:space="0" w:color="auto"/>
+          <w:insideH w:val="single" w:sz="4" w:space="0" w:color="auto"/>
+          <w:insideV w:val="single" w:sz="4" w:space="0" w:color="auto"/>
+        </w:tblBorders>
+        <w:tblCellMar>
+          <w:left w:w="10" w:type="dxa"/>
+          <w:right w:w="10" w:type="dxa"/>
+        </w:tblCellMar>
+        <w:tblLook w:val="0000" w:firstRow="0" w:lastRow="0" w:firstColumn="0" w:lastColumn="0" w:noHBand="0" w:noVBand="0"/>
+      </w:tblPr>
+      <w:tblGrid>
+        <w:gridCol w:w="2400"/>
+        <w:gridCol w:w="6960"/>
+      </w:tblGrid>
+      <w:tr>
+        <w:tc>
+          <w:tcPr>
+            <w:tcW w:w="2400" w:type="dxa"/>
+            <w:tcBorders>
+              <w:top w:val="single" w:sz="4" w:space="0" w:color="BFBFBF"/>
+              <w:left w:val="single" w:sz="4" w:space="0" w:color="BFBFBF"/>
+              <w:bottom w:val="single" w:sz="4" w:space="0" w:color="BFBFBF"/>
+              <w:right w:val="single" w:sz="4" w:space="0" w:color="BFBFBF"/>
+            </w:tcBorders>
+            <w:shd w:val="clear" w:color="auto" w:fill="EAF0F8"/>
+            <w:tcMar>
+              <w:top w:w="80" w:type="dxa"/>
+              <w:left w:w="120" w:type="dxa"/>
+              <w:bottom w:w="80" w:type="dxa"/>
+              <w:right w:w="120" w:type="dxa"/>
+            </w:tcMar>
+          </w:tcPr>
+          <w:p>
+            <w:r>
+              <w:rPr>
+                <w:b/>
+                <w:bCs/>
+              </w:rPr>
+              <w:t>Fecha</w:t>
+            </w:r>
+          </w:p>
+        </w:tc>
+        <w:tc>
+          <w:tcPr>
+            <w:tcW w:w="6960" w:type="dxa"/>
+            <w:tcBorders>
+              <w:top w:val="single" w:sz="4" w:space="0" w:color="BFBFBF"/>
+              <w:left w:val="single" w:sz="4" w:space="0" w:color="BFBFBF"/>
+              <w:bottom w:val="single" w:sz="4" w:space="0" w:color="BFBFBF"/>
+              <w:right w:val="single" w:sz="4" w:space="0" w:color="BFBFBF"/>
+            </w:tcBorders>
+            <w:tcMar>
+              <w:top w:w="80" w:type="dxa"/>
+              <w:left w:w="120" w:type="dxa"/>
+              <w:bottom w:w="80" w:type="dxa"/>
+              <w:right w:w="120" w:type="dxa"/>
+            </w:tcMar>
+          </w:tcPr>
+          <w:p>
+            <w:pPr>
+              <w:rPr>
+                <w:lang w:val="es-CR"/>
+              </w:rPr>
+            </w:pPr>
+            <w:r>
+              <w:rPr>
+                <w:lang w:val="es-CR"/>
+              </w:rPr>
+              <w:t>23/10/2026</w:t>
+            </w:r>
+          </w:p>
+        </w:tc>
+      </w:tr>
+      <w:tr>
+        <w:tc>
+          <w:tcPr>
+            <w:tcW w:w="2400" w:type="dxa"/>
+            <w:tcBorders>
+              <w:top w:val="single" w:sz="4" w:space="0" w:color="BFBFBF"/>
+              <w:left w:val="single" w:sz="4" w:space="0" w:color="BFBFBF"/>
+              <w:bottom w:val="single" w:sz="4" w:space="0" w:color="BFBFBF"/>
+              <w:right w:val="single" w:sz="4" w:space="0" w:color="BFBFBF"/>
+            </w:tcBorders>
+            <w:shd w:val="clear" w:color="auto" w:fill="EAF0F8"/>
+            <w:tcMar>
+              <w:top w:w="80" w:type="dxa"/>
+              <w:left w:w="120" w:type="dxa"/>
+              <w:bottom w:w="80" w:type="dxa"/>
+              <w:right w:w="120" w:type="dxa"/>
+            </w:tcMar>
+          </w:tcPr>
+          <w:p>
+            <w:r>
+              <w:rPr>
+                <w:b/>
+                <w:bCs/>
+              </w:rPr>
+              <w:t>Herramienta</w:t>
+            </w:r>
+          </w:p>
+        </w:tc>
+        <w:tc>
+          <w:tcPr>
+            <w:tcW w:w="6960" w:type="dxa"/>
+            <w:tcBorders>
+              <w:top w:val="single" w:sz="4" w:space="0" w:color="BFBFBF"/>
+              <w:left w:val="single" w:sz="4" w:space="0" w:color="BFBFBF"/>
+              <w:bottom w:val="single" w:sz="4" w:space="0" w:color="BFBFBF"/>
+              <w:right w:val="single" w:sz="4" w:space="0" w:color="BFBFBF"/>
+            </w:tcBorders>
+            <w:tcMar>
+              <w:top w:w="80" w:type="dxa"/>
+              <w:left w:w="120" w:type="dxa"/>
+              <w:bottom w:w="80" w:type="dxa"/>
+              <w:right w:w="120" w:type="dxa"/>
+            </w:tcMar>
+          </w:tcPr>
+          <w:p>
+            <w:proofErr w:type="spellStart"/>
+            <w:r>
+              <w:t>ChatGPT</w:t>
+            </w:r>
+            <w:proofErr w:type="spellEnd"/>
+          </w:p>
+        </w:tc>
+      </w:tr>
+      <w:tr>
+        <w:tc>
+          <w:tcPr>
+            <w:tcW w:w="2400" w:type="dxa"/>
+            <w:tcBorders>
+              <w:top w:val="single" w:sz="4" w:space="0" w:color="BFBFBF"/>
+              <w:left w:val="single" w:sz="4" w:space="0" w:color="BFBFBF"/>
+              <w:bottom w:val="single" w:sz="4" w:space="0" w:color="BFBFBF"/>
+              <w:right w:val="single" w:sz="4" w:space="0" w:color="BFBFBF"/>
+            </w:tcBorders>
+            <w:shd w:val="clear" w:color="auto" w:fill="EAF0F8"/>
+            <w:tcMar>
+              <w:top w:w="80" w:type="dxa"/>
+              <w:left w:w="120" w:type="dxa"/>
+              <w:bottom w:w="80" w:type="dxa"/>
+              <w:right w:w="120" w:type="dxa"/>
+            </w:tcMar>
+          </w:tcPr>
+          <w:p>
+            <w:proofErr w:type="spellStart"/>
+            <w:r>
+              <w:rPr>
+                <w:b/>
+                <w:bCs/>
+              </w:rPr>
+              <w:t>Prompt</w:t>
+            </w:r>
+            <w:proofErr w:type="spellEnd"/>
+          </w:p>
+        </w:tc>
+        <w:tc>
+          <w:tcPr>
+            <w:tcW w:w="6960" w:type="dxa"/>
+            <w:tcBorders>
+              <w:top w:val="single" w:sz="4" w:space="0" w:color="BFBFBF"/>
+              <w:left w:val="single" w:sz="4" w:space="0" w:color="BFBFBF"/>
+              <w:bottom w:val="single" w:sz="4" w:space="0" w:color="BFBFBF"/>
+              <w:right w:val="single" w:sz="4" w:space="0" w:color="BFBFBF"/>
+            </w:tcBorders>
+            <w:tcMar>
+              <w:top w:w="80" w:type="dxa"/>
+              <w:left w:w="120" w:type="dxa"/>
+              <w:bottom w:w="80" w:type="dxa"/>
+              <w:right w:w="120" w:type="dxa"/>
+            </w:tcMar>
+          </w:tcPr>
+          <w:p>
+            <w:pPr>
+              <w:rPr>
+                <w:lang w:val="es-CR"/>
+              </w:rPr>
+            </w:pPr>
+            <w:r>
+              <w:rPr>
+                <w:lang w:val="es-CR"/>
+              </w:rPr>
+              <w:t>Se solicitó ayuda para mejorar el gráfico de memoria y permitir seleccionar un proceso específico. También se pidió mostrar los crecimientos de memoria según un porcentaje configurable.</w:t>
+            </w:r>
+          </w:p>
+        </w:tc>
+      </w:tr>
+      <w:tr>
+        <w:tc>
+          <w:tcPr>
+            <w:tcW w:w="2400" w:type="dxa"/>
+            <w:tcBorders>
+              <w:top w:val="single" w:sz="4" w:space="0" w:color="BFBFBF"/>
+              <w:left w:val="single" w:sz="4" w:space="0" w:color="BFBFBF"/>
+              <w:bottom w:val="single" w:sz="4" w:space="0" w:color="BFBFBF"/>
+              <w:right w:val="single" w:sz="4" w:space="0" w:color="BFBFBF"/>
+            </w:tcBorders>
+            <w:shd w:val="clear" w:color="auto" w:fill="EAF0F8"/>
+            <w:tcMar>
+              <w:top w:w="80" w:type="dxa"/>
+              <w:left w:w="120" w:type="dxa"/>
+              <w:bottom w:w="80" w:type="dxa"/>
+              <w:right w:w="120" w:type="dxa"/>
+            </w:tcMar>
+          </w:tcPr>
+          <w:p>
+            <w:r>
+              <w:rPr>
+                <w:b/>
+                <w:bCs/>
+              </w:rPr>
+              <w:t>Qué devolvió</w:t>
+            </w:r>
+          </w:p>
+        </w:tc>
+        <w:tc>
+          <w:tcPr>
+            <w:tcW w:w="6960" w:type="dxa"/>
+            <w:tcBorders>
+              <w:top w:val="single" w:sz="4" w:space="0" w:color="BFBFBF"/>
+              <w:left w:val="single" w:sz="4" w:space="0" w:color="BFBFBF"/>
+              <w:bottom w:val="single" w:sz="4" w:space="0" w:color="BFBFBF"/>
+              <w:right w:val="single" w:sz="4" w:space="0" w:color="BFBFBF"/>
+            </w:tcBorders>
+            <w:tcMar>
+              <w:top w:w="80" w:type="dxa"/>
+              <w:left w:w="120" w:type="dxa"/>
+              <w:bottom w:w="80" w:type="dxa"/>
+              <w:right w:w="120" w:type="dxa"/>
+            </w:tcMar>
+          </w:tcPr>
+          <w:p>
+            <w:pPr>
+              <w:rPr>
+                <w:lang w:val="es-CR"/>
+              </w:rPr>
+            </w:pPr>
+            <w:proofErr w:type="spellStart"/>
+            <w:r>
+              <w:rPr>
+                <w:lang w:val="es-CR"/>
+              </w:rPr>
+              <w:t>ChatGPT</w:t>
+            </w:r>
+            <w:proofErr w:type="spellEnd"/>
+            <w:r>
+              <w:rPr>
+                <w:lang w:val="es-CR"/>
+              </w:rPr>
+              <w:t xml:space="preserve"> proporcionó código JavaScript para agregar un selector de procesos y calcular crecimientos adicionales de memoria. También propuso mostrar alertas con distintos colores.</w:t>
+            </w:r>
+          </w:p>
+        </w:tc>
+      </w:tr>
+      <w:tr>
+        <w:tc>
+          <w:tcPr>
+            <w:tcW w:w="2400" w:type="dxa"/>
+            <w:tcBorders>
+              <w:top w:val="single" w:sz="4" w:space="0" w:color="BFBFBF"/>
+              <w:left w:val="single" w:sz="4" w:space="0" w:color="BFBFBF"/>
+              <w:bottom w:val="single" w:sz="4" w:space="0" w:color="BFBFBF"/>
+              <w:right w:val="single" w:sz="4" w:space="0" w:color="BFBFBF"/>
+            </w:tcBorders>
+            <w:shd w:val="clear" w:color="auto" w:fill="EAF0F8"/>
+            <w:tcMar>
+              <w:top w:w="80" w:type="dxa"/>
+              <w:left w:w="120" w:type="dxa"/>
+              <w:bottom w:w="80" w:type="dxa"/>
+              <w:right w:w="120" w:type="dxa"/>
+            </w:tcMar>
+          </w:tcPr>
+          <w:p>
+            <w:r>
+              <w:rPr>
+                <w:b/>
+                <w:bCs/>
+              </w:rPr>
+              <w:lastRenderedPageBreak/>
+              <w:t>Qué verificaron y cómo</w:t>
+            </w:r>
+          </w:p>
+        </w:tc>
+        <w:tc>
+          <w:tcPr>
+            <w:tcW w:w="6960" w:type="dxa"/>
+            <w:tcBorders>
+              <w:top w:val="single" w:sz="4" w:space="0" w:color="BFBFBF"/>
+              <w:left w:val="single" w:sz="4" w:space="0" w:color="BFBFBF"/>
+              <w:bottom w:val="single" w:sz="4" w:space="0" w:color="BFBFBF"/>
+              <w:right w:val="single" w:sz="4" w:space="0" w:color="BFBFBF"/>
+            </w:tcBorders>
+            <w:tcMar>
+              <w:top w:w="80" w:type="dxa"/>
+              <w:left w:w="120" w:type="dxa"/>
+              <w:bottom w:w="80" w:type="dxa"/>
+              <w:right w:w="120" w:type="dxa"/>
+            </w:tcMar>
+          </w:tcPr>
+          <w:p>
+            <w:pPr>
+              <w:rPr>
+                <w:lang w:val="es-CR"/>
+              </w:rPr>
+            </w:pPr>
+            <w:r>
+              <w:rPr>
+                <w:lang w:val="es-CR"/>
+              </w:rPr>
+              <w:t>Cargamos el JSON de ejemplo y seleccionamos el proceso PowerShell con PID 19272. Comprobamos que el gráfico mostrara su crecimiento de memoria. También revisamos que con un umbral del 50 % apareciera la alerta original y el crecimiento adicional calculado por la página.</w:t>
+            </w:r>
+          </w:p>
+        </w:tc>
+      </w:tr>
+      <w:tr>
+        <w:tc>
+          <w:tcPr>
+            <w:tcW w:w="2400" w:type="dxa"/>
+            <w:tcBorders>
+              <w:top w:val="single" w:sz="4" w:space="0" w:color="BFBFBF"/>
+              <w:left w:val="single" w:sz="4" w:space="0" w:color="BFBFBF"/>
+              <w:bottom w:val="single" w:sz="4" w:space="0" w:color="BFBFBF"/>
+              <w:right w:val="single" w:sz="4" w:space="0" w:color="BFBFBF"/>
+            </w:tcBorders>
+            <w:shd w:val="clear" w:color="auto" w:fill="EAF0F8"/>
+            <w:tcMar>
+              <w:top w:w="80" w:type="dxa"/>
+              <w:left w:w="120" w:type="dxa"/>
+              <w:bottom w:w="80" w:type="dxa"/>
+              <w:right w:w="120" w:type="dxa"/>
+            </w:tcMar>
+          </w:tcPr>
+          <w:p>
+            <w:r>
+              <w:rPr>
+                <w:b/>
+                <w:bCs/>
+              </w:rPr>
+              <w:t>Qué corrigieron o descartaron</w:t>
+            </w:r>
+          </w:p>
+        </w:tc>
+        <w:tc>
+          <w:tcPr>
+            <w:tcW w:w="6960" w:type="dxa"/>
+            <w:tcBorders>
+              <w:top w:val="single" w:sz="4" w:space="0" w:color="BFBFBF"/>
+              <w:left w:val="single" w:sz="4" w:space="0" w:color="BFBFBF"/>
+              <w:bottom w:val="single" w:sz="4" w:space="0" w:color="BFBFBF"/>
+              <w:right w:val="single" w:sz="4" w:space="0" w:color="BFBFBF"/>
+            </w:tcBorders>
+            <w:tcMar>
+              <w:top w:w="80" w:type="dxa"/>
+              <w:left w:w="120" w:type="dxa"/>
+              <w:bottom w:w="80" w:type="dxa"/>
+              <w:right w:w="120" w:type="dxa"/>
+            </w:tcMar>
+          </w:tcPr>
+          <w:p>
+            <w:pPr>
+              <w:rPr>
+                <w:lang w:val="es-CR"/>
+              </w:rPr>
+            </w:pPr>
+            <w:r>
+              <w:rPr>
+                <w:lang w:val="es-CR"/>
+              </w:rPr>
+              <w:t>La primera modificación del selector no cambiaba correctamente el gráfico. Se revisó la función y se corrigió el código. También diferenciamos las alertas originales del monitor con color rojo y las detecciones adicionales de la web con color amarillo.</w:t>
+            </w:r>
+          </w:p>
+        </w:tc>
+      </w:tr>
+      <w:tr>
+        <w:tc>
+          <w:tcPr>
+            <w:tcW w:w="2400" w:type="dxa"/>
+            <w:tcBorders>
+              <w:top w:val="single" w:sz="4" w:space="0" w:color="BFBFBF"/>
+              <w:left w:val="single" w:sz="4" w:space="0" w:color="BFBFBF"/>
+              <w:bottom w:val="single" w:sz="4" w:space="0" w:color="BFBFBF"/>
+              <w:right w:val="single" w:sz="4" w:space="0" w:color="BFBFBF"/>
+            </w:tcBorders>
+            <w:shd w:val="clear" w:color="auto" w:fill="EAF0F8"/>
+            <w:tcMar>
+              <w:top w:w="80" w:type="dxa"/>
+              <w:left w:w="120" w:type="dxa"/>
+              <w:bottom w:w="80" w:type="dxa"/>
+              <w:right w:w="120" w:type="dxa"/>
+            </w:tcMar>
+          </w:tcPr>
+          <w:p>
+            <w:r>
+              <w:rPr>
+                <w:b/>
+                <w:bCs/>
+              </w:rPr>
+              <w:t>Qué aprendieron</w:t>
+            </w:r>
+          </w:p>
+        </w:tc>
+        <w:tc>
+          <w:tcPr>
+            <w:tcW w:w="6960" w:type="dxa"/>
+            <w:tcBorders>
+              <w:top w:val="single" w:sz="4" w:space="0" w:color="BFBFBF"/>
+              <w:left w:val="single" w:sz="4" w:space="0" w:color="BFBFBF"/>
+              <w:bottom w:val="single" w:sz="4" w:space="0" w:color="BFBFBF"/>
+              <w:right w:val="single" w:sz="4" w:space="0" w:color="BFBFBF"/>
+            </w:tcBorders>
+            <w:tcMar>
+              <w:top w:w="80" w:type="dxa"/>
+              <w:left w:w="120" w:type="dxa"/>
+              <w:bottom w:w="80" w:type="dxa"/>
+              <w:right w:w="120" w:type="dxa"/>
+            </w:tcMar>
+          </w:tcPr>
+          <w:p>
+            <w:pPr>
+              <w:rPr>
+                <w:lang w:val="es-CR"/>
+              </w:rPr>
+            </w:pPr>
+            <w:r>
+              <w:rPr>
+                <w:lang w:val="es-CR"/>
+              </w:rPr>
+              <w:t>Aprendimos que una misma situación puede producir resultados diferentes según el método de cálculo. El monitor detectó un crecimiento del 160 % y la página calculó un 526,3 % usando otro período. Esto no significa que existieran dos ataques.</w:t>
+            </w:r>
+          </w:p>
+        </w:tc>
+      </w:tr>
+    </w:tbl>
+    <w:p/>
+    <w:p/>
+    <w:p>
+      <w:pPr>
+        <w:pStyle w:val="Ttulo2"/>
+        <w:spacing w:before="300" w:after="120"/>
+        <w:rPr>
+          <w:b/>
+          <w:bCs/>
+          <w:color w:val="1F3864"/>
+          <w:sz w:val="28"/>
+          <w:szCs w:val="28"/>
+        </w:rPr>
+      </w:pPr>
+      <w:r>
+        <w:rPr>
+          <w:b/>
+          <w:bCs/>
+          <w:color w:val="1F3864"/>
+          <w:sz w:val="28"/>
+          <w:szCs w:val="28"/>
+        </w:rPr>
+        <w:t xml:space="preserve">Entrada </w:t>
+      </w:r>
+      <w:r>
+        <w:rPr>
+          <w:b/>
+          <w:bCs/>
+          <w:color w:val="1F3864"/>
+          <w:sz w:val="28"/>
+          <w:szCs w:val="28"/>
+        </w:rPr>
+        <w:t>5</w:t>
+      </w:r>
+    </w:p>
+    <w:tbl>
+      <w:tblPr>
+        <w:tblW w:w="9360" w:type="dxa"/>
+        <w:tblBorders>
+          <w:top w:val="single" w:sz="4" w:space="0" w:color="auto"/>
+          <w:left w:val="single" w:sz="4" w:space="0" w:color="auto"/>
+          <w:bottom w:val="single" w:sz="4" w:space="0" w:color="auto"/>
+          <w:right w:val="single" w:sz="4" w:space="0" w:color="auto"/>
+          <w:insideH w:val="single" w:sz="4" w:space="0" w:color="auto"/>
+          <w:insideV w:val="single" w:sz="4" w:space="0" w:color="auto"/>
+        </w:tblBorders>
+        <w:tblCellMar>
+          <w:left w:w="10" w:type="dxa"/>
+          <w:right w:w="10" w:type="dxa"/>
+        </w:tblCellMar>
+        <w:tblLook w:val="0000" w:firstRow="0" w:lastRow="0" w:firstColumn="0" w:lastColumn="0" w:noHBand="0" w:noVBand="0"/>
+      </w:tblPr>
+      <w:tblGrid>
+        <w:gridCol w:w="2400"/>
+        <w:gridCol w:w="6960"/>
+      </w:tblGrid>
+      <w:tr>
+        <w:tc>
+          <w:tcPr>
+            <w:tcW w:w="2400" w:type="dxa"/>
+            <w:tcBorders>
+              <w:top w:val="single" w:sz="4" w:space="0" w:color="BFBFBF"/>
+              <w:left w:val="single" w:sz="4" w:space="0" w:color="BFBFBF"/>
+              <w:bottom w:val="single" w:sz="4" w:space="0" w:color="BFBFBF"/>
+              <w:right w:val="single" w:sz="4" w:space="0" w:color="BFBFBF"/>
+            </w:tcBorders>
+            <w:shd w:val="clear" w:color="auto" w:fill="EAF0F8"/>
+            <w:tcMar>
+              <w:top w:w="80" w:type="dxa"/>
+              <w:left w:w="120" w:type="dxa"/>
+              <w:bottom w:w="80" w:type="dxa"/>
+              <w:right w:w="120" w:type="dxa"/>
+            </w:tcMar>
+          </w:tcPr>
+          <w:p>
+            <w:r>
+              <w:rPr>
+                <w:b/>
+                <w:bCs/>
+              </w:rPr>
+              <w:t>Fecha</w:t>
+            </w:r>
+          </w:p>
+        </w:tc>
+        <w:tc>
+          <w:tcPr>
+            <w:tcW w:w="6960" w:type="dxa"/>
+            <w:tcBorders>
+              <w:top w:val="single" w:sz="4" w:space="0" w:color="BFBFBF"/>
+              <w:left w:val="single" w:sz="4" w:space="0" w:color="BFBFBF"/>
+              <w:bottom w:val="single" w:sz="4" w:space="0" w:color="BFBFBF"/>
+              <w:right w:val="single" w:sz="4" w:space="0" w:color="BFBFBF"/>
+            </w:tcBorders>
+            <w:tcMar>
+              <w:top w:w="80" w:type="dxa"/>
+              <w:left w:w="120" w:type="dxa"/>
+              <w:bottom w:w="80" w:type="dxa"/>
+              <w:right w:w="120" w:type="dxa"/>
+            </w:tcMar>
+          </w:tcPr>
+          <w:p>
+            <w:pPr>
+              <w:rPr>
+                <w:lang w:val="es-CR"/>
+              </w:rPr>
+            </w:pPr>
+            <w:r>
+              <w:rPr>
+                <w:lang w:val="es-CR"/>
+              </w:rPr>
+              <w:t>23/10/2026</w:t>
+            </w:r>
+          </w:p>
+        </w:tc>
+      </w:tr>
+      <w:tr>
+        <w:tc>
+          <w:tcPr>
+            <w:tcW w:w="2400" w:type="dxa"/>
+            <w:tcBorders>
+              <w:top w:val="single" w:sz="4" w:space="0" w:color="BFBFBF"/>
+              <w:left w:val="single" w:sz="4" w:space="0" w:color="BFBFBF"/>
+              <w:bottom w:val="single" w:sz="4" w:space="0" w:color="BFBFBF"/>
+              <w:right w:val="single" w:sz="4" w:space="0" w:color="BFBFBF"/>
+            </w:tcBorders>
+            <w:shd w:val="clear" w:color="auto" w:fill="EAF0F8"/>
+            <w:tcMar>
+              <w:top w:w="80" w:type="dxa"/>
+              <w:left w:w="120" w:type="dxa"/>
+              <w:bottom w:w="80" w:type="dxa"/>
+              <w:right w:w="120" w:type="dxa"/>
+            </w:tcMar>
+          </w:tcPr>
+          <w:p>
+            <w:r>
+              <w:rPr>
+                <w:b/>
+                <w:bCs/>
+              </w:rPr>
+              <w:t>Herramienta</w:t>
+            </w:r>
+          </w:p>
+        </w:tc>
+        <w:tc>
+          <w:tcPr>
+            <w:tcW w:w="6960" w:type="dxa"/>
+            <w:tcBorders>
+              <w:top w:val="single" w:sz="4" w:space="0" w:color="BFBFBF"/>
+              <w:left w:val="single" w:sz="4" w:space="0" w:color="BFBFBF"/>
+              <w:bottom w:val="single" w:sz="4" w:space="0" w:color="BFBFBF"/>
+              <w:right w:val="single" w:sz="4" w:space="0" w:color="BFBFBF"/>
+            </w:tcBorders>
+            <w:tcMar>
+              <w:top w:w="80" w:type="dxa"/>
+              <w:left w:w="120" w:type="dxa"/>
+              <w:bottom w:w="80" w:type="dxa"/>
+              <w:right w:w="120" w:type="dxa"/>
+            </w:tcMar>
+          </w:tcPr>
+          <w:p>
+            <w:proofErr w:type="spellStart"/>
+            <w:r>
+              <w:t>ChatGPT</w:t>
+            </w:r>
+            <w:proofErr w:type="spellEnd"/>
+          </w:p>
+        </w:tc>
+      </w:tr>
+      <w:tr>
+        <w:tc>
+          <w:tcPr>
+            <w:tcW w:w="2400" w:type="dxa"/>
+            <w:tcBorders>
+              <w:top w:val="single" w:sz="4" w:space="0" w:color="BFBFBF"/>
+              <w:left w:val="single" w:sz="4" w:space="0" w:color="BFBFBF"/>
+              <w:bottom w:val="single" w:sz="4" w:space="0" w:color="BFBFBF"/>
+              <w:right w:val="single" w:sz="4" w:space="0" w:color="BFBFBF"/>
+            </w:tcBorders>
+            <w:shd w:val="clear" w:color="auto" w:fill="EAF0F8"/>
+            <w:tcMar>
+              <w:top w:w="80" w:type="dxa"/>
+              <w:left w:w="120" w:type="dxa"/>
+              <w:bottom w:w="80" w:type="dxa"/>
+              <w:right w:w="120" w:type="dxa"/>
+            </w:tcMar>
+          </w:tcPr>
+          <w:p>
+            <w:proofErr w:type="spellStart"/>
+            <w:r>
+              <w:rPr>
+                <w:b/>
+                <w:bCs/>
+              </w:rPr>
+              <w:t>Prompt</w:t>
+            </w:r>
+            <w:proofErr w:type="spellEnd"/>
+          </w:p>
+        </w:tc>
+        <w:tc>
+          <w:tcPr>
+            <w:tcW w:w="6960" w:type="dxa"/>
+            <w:tcBorders>
+              <w:top w:val="single" w:sz="4" w:space="0" w:color="BFBFBF"/>
+              <w:left w:val="single" w:sz="4" w:space="0" w:color="BFBFBF"/>
+              <w:bottom w:val="single" w:sz="4" w:space="0" w:color="BFBFBF"/>
+              <w:right w:val="single" w:sz="4" w:space="0" w:color="BFBFBF"/>
+            </w:tcBorders>
+            <w:tcMar>
+              <w:top w:w="80" w:type="dxa"/>
+              <w:left w:w="120" w:type="dxa"/>
+              <w:bottom w:w="80" w:type="dxa"/>
+              <w:right w:w="120" w:type="dxa"/>
+            </w:tcMar>
+          </w:tcPr>
+          <w:p>
+            <w:pPr>
+              <w:rPr>
+                <w:lang w:val="es-CR"/>
+              </w:rPr>
+            </w:pPr>
+            <w:r>
+              <w:rPr>
+                <w:lang w:val="es-CR"/>
+              </w:rPr>
+              <w:t>Se pidió ayuda para comprobar que la aplicación manejara correctamente archivos JSON vacíos o con información incompleta.</w:t>
+            </w:r>
+          </w:p>
+        </w:tc>
+      </w:tr>
+      <w:tr>
+        <w:tc>
+          <w:tcPr>
+            <w:tcW w:w="2400" w:type="dxa"/>
+            <w:tcBorders>
+              <w:top w:val="single" w:sz="4" w:space="0" w:color="BFBFBF"/>
+              <w:left w:val="single" w:sz="4" w:space="0" w:color="BFBFBF"/>
+              <w:bottom w:val="single" w:sz="4" w:space="0" w:color="BFBFBF"/>
+              <w:right w:val="single" w:sz="4" w:space="0" w:color="BFBFBF"/>
+            </w:tcBorders>
+            <w:shd w:val="clear" w:color="auto" w:fill="EAF0F8"/>
+            <w:tcMar>
+              <w:top w:w="80" w:type="dxa"/>
+              <w:left w:w="120" w:type="dxa"/>
+              <w:bottom w:w="80" w:type="dxa"/>
+              <w:right w:w="120" w:type="dxa"/>
+            </w:tcMar>
+          </w:tcPr>
+          <w:p>
+            <w:r>
+              <w:rPr>
+                <w:b/>
+                <w:bCs/>
+              </w:rPr>
+              <w:t>Qué devolvió</w:t>
+            </w:r>
+          </w:p>
+        </w:tc>
+        <w:tc>
+          <w:tcPr>
+            <w:tcW w:w="6960" w:type="dxa"/>
+            <w:tcBorders>
+              <w:top w:val="single" w:sz="4" w:space="0" w:color="BFBFBF"/>
+              <w:left w:val="single" w:sz="4" w:space="0" w:color="BFBFBF"/>
+              <w:bottom w:val="single" w:sz="4" w:space="0" w:color="BFBFBF"/>
+              <w:right w:val="single" w:sz="4" w:space="0" w:color="BFBFBF"/>
+            </w:tcBorders>
+            <w:tcMar>
+              <w:top w:w="80" w:type="dxa"/>
+              <w:left w:w="120" w:type="dxa"/>
+              <w:bottom w:w="80" w:type="dxa"/>
+              <w:right w:w="120" w:type="dxa"/>
+            </w:tcMar>
+          </w:tcPr>
+          <w:p>
+            <w:pPr>
+              <w:rPr>
+                <w:lang w:val="es-CR"/>
+              </w:rPr>
+            </w:pPr>
+            <w:proofErr w:type="spellStart"/>
+            <w:r>
+              <w:rPr>
+                <w:lang w:val="es-CR"/>
+              </w:rPr>
+              <w:t>ChatGPT</w:t>
+            </w:r>
+            <w:proofErr w:type="spellEnd"/>
+            <w:r>
+              <w:rPr>
+                <w:lang w:val="es-CR"/>
+              </w:rPr>
+              <w:t xml:space="preserve"> propuso crear dos archivos de prueba y agregar validaciones para mostrar mensajes de error comprensibles.</w:t>
+            </w:r>
+          </w:p>
+        </w:tc>
+      </w:tr>
+      <w:tr>
+        <w:tc>
+          <w:tcPr>
+            <w:tcW w:w="2400" w:type="dxa"/>
+            <w:tcBorders>
+              <w:top w:val="single" w:sz="4" w:space="0" w:color="BFBFBF"/>
+              <w:left w:val="single" w:sz="4" w:space="0" w:color="BFBFBF"/>
+              <w:bottom w:val="single" w:sz="4" w:space="0" w:color="BFBFBF"/>
+              <w:right w:val="single" w:sz="4" w:space="0" w:color="BFBFBF"/>
+            </w:tcBorders>
+            <w:shd w:val="clear" w:color="auto" w:fill="EAF0F8"/>
+            <w:tcMar>
+              <w:top w:w="80" w:type="dxa"/>
+              <w:left w:w="120" w:type="dxa"/>
+              <w:bottom w:w="80" w:type="dxa"/>
+              <w:right w:w="120" w:type="dxa"/>
+            </w:tcMar>
+          </w:tcPr>
+          <w:p>
+            <w:r>
+              <w:rPr>
+                <w:b/>
+                <w:bCs/>
+              </w:rPr>
+              <w:t>Qué verificaron y cómo</w:t>
+            </w:r>
+          </w:p>
+        </w:tc>
+        <w:tc>
+          <w:tcPr>
+            <w:tcW w:w="6960" w:type="dxa"/>
+            <w:tcBorders>
+              <w:top w:val="single" w:sz="4" w:space="0" w:color="BFBFBF"/>
+              <w:left w:val="single" w:sz="4" w:space="0" w:color="BFBFBF"/>
+              <w:bottom w:val="single" w:sz="4" w:space="0" w:color="BFBFBF"/>
+              <w:right w:val="single" w:sz="4" w:space="0" w:color="BFBFBF"/>
+            </w:tcBorders>
+            <w:tcMar>
+              <w:top w:w="80" w:type="dxa"/>
+              <w:left w:w="120" w:type="dxa"/>
+              <w:bottom w:w="80" w:type="dxa"/>
+              <w:right w:w="120" w:type="dxa"/>
+            </w:tcMar>
+          </w:tcPr>
+          <w:p>
+            <w:pPr>
+              <w:rPr>
+                <w:lang w:val="es-CR"/>
+              </w:rPr>
+            </w:pPr>
+            <w:r>
+              <w:rPr>
+                <w:lang w:val="es-CR"/>
+              </w:rPr>
+              <w:t xml:space="preserve">Probamos </w:t>
+            </w:r>
+            <w:proofErr w:type="spellStart"/>
+            <w:r>
+              <w:rPr>
+                <w:lang w:val="es-CR"/>
+              </w:rPr>
+              <w:t>prueba_</w:t>
+            </w:r>
+            <w:proofErr w:type="gramStart"/>
+            <w:r>
+              <w:rPr>
+                <w:lang w:val="es-CR"/>
+              </w:rPr>
+              <w:t>invalida.json</w:t>
+            </w:r>
+            <w:proofErr w:type="spellEnd"/>
+            <w:proofErr w:type="gramEnd"/>
+            <w:r>
+              <w:rPr>
+                <w:lang w:val="es-CR"/>
+              </w:rPr>
+              <w:t xml:space="preserve"> y </w:t>
+            </w:r>
+            <w:proofErr w:type="spellStart"/>
+            <w:r>
+              <w:rPr>
+                <w:lang w:val="es-CR"/>
+              </w:rPr>
+              <w:t>prueba_</w:t>
+            </w:r>
+            <w:proofErr w:type="gramStart"/>
+            <w:r>
+              <w:rPr>
+                <w:lang w:val="es-CR"/>
+              </w:rPr>
+              <w:t>vacia.json</w:t>
+            </w:r>
+            <w:proofErr w:type="spellEnd"/>
+            <w:proofErr w:type="gramEnd"/>
+            <w:r>
+              <w:rPr>
+                <w:lang w:val="es-CR"/>
+              </w:rPr>
+              <w:t>. La aplicación mostró mensajes de error y deshabilitó los botones de exportación. Después comprobamos que se pudieran volver a cargar los datos de ejemplo.</w:t>
+            </w:r>
+          </w:p>
+        </w:tc>
+      </w:tr>
+      <w:tr>
+        <w:tc>
+          <w:tcPr>
+            <w:tcW w:w="2400" w:type="dxa"/>
+            <w:tcBorders>
+              <w:top w:val="single" w:sz="4" w:space="0" w:color="BFBFBF"/>
+              <w:left w:val="single" w:sz="4" w:space="0" w:color="BFBFBF"/>
+              <w:bottom w:val="single" w:sz="4" w:space="0" w:color="BFBFBF"/>
+              <w:right w:val="single" w:sz="4" w:space="0" w:color="BFBFBF"/>
+            </w:tcBorders>
+            <w:shd w:val="clear" w:color="auto" w:fill="EAF0F8"/>
+            <w:tcMar>
+              <w:top w:w="80" w:type="dxa"/>
+              <w:left w:w="120" w:type="dxa"/>
+              <w:bottom w:w="80" w:type="dxa"/>
+              <w:right w:w="120" w:type="dxa"/>
+            </w:tcMar>
+          </w:tcPr>
+          <w:p>
+            <w:r>
+              <w:rPr>
+                <w:b/>
+                <w:bCs/>
+              </w:rPr>
+              <w:t>Qué corrigieron o descartaron</w:t>
+            </w:r>
+          </w:p>
+        </w:tc>
+        <w:tc>
+          <w:tcPr>
+            <w:tcW w:w="6960" w:type="dxa"/>
+            <w:tcBorders>
+              <w:top w:val="single" w:sz="4" w:space="0" w:color="BFBFBF"/>
+              <w:left w:val="single" w:sz="4" w:space="0" w:color="BFBFBF"/>
+              <w:bottom w:val="single" w:sz="4" w:space="0" w:color="BFBFBF"/>
+              <w:right w:val="single" w:sz="4" w:space="0" w:color="BFBFBF"/>
+            </w:tcBorders>
+            <w:tcMar>
+              <w:top w:w="80" w:type="dxa"/>
+              <w:left w:w="120" w:type="dxa"/>
+              <w:bottom w:w="80" w:type="dxa"/>
+              <w:right w:w="120" w:type="dxa"/>
+            </w:tcMar>
+          </w:tcPr>
+          <w:p>
+            <w:pPr>
+              <w:rPr>
+                <w:lang w:val="es-CR"/>
+              </w:rPr>
+            </w:pPr>
+            <w:r>
+              <w:rPr>
+                <w:lang w:val="es-CR"/>
+              </w:rPr>
+              <w:t xml:space="preserve">Durante las pruebas vimos que al cargar un JSON incorrecto aparecía el mensaje de </w:t>
+            </w:r>
+            <w:proofErr w:type="gramStart"/>
+            <w:r>
+              <w:rPr>
+                <w:lang w:val="es-CR"/>
+              </w:rPr>
+              <w:t>error</w:t>
+            </w:r>
+            <w:proofErr w:type="gramEnd"/>
+            <w:r>
+              <w:rPr>
+                <w:lang w:val="es-CR"/>
+              </w:rPr>
+              <w:t xml:space="preserve"> pero los gráficos anteriores seguían visibles. Le pedimos a </w:t>
+            </w:r>
+            <w:proofErr w:type="spellStart"/>
+            <w:r>
+              <w:rPr>
+                <w:lang w:val="es-CR"/>
+              </w:rPr>
+              <w:t>ChatGPT</w:t>
+            </w:r>
+            <w:proofErr w:type="spellEnd"/>
+            <w:r>
+              <w:rPr>
+                <w:lang w:val="es-CR"/>
+              </w:rPr>
+              <w:t xml:space="preserve"> que nos ayudara a solucionar esto. Modificamos el código para limpiar los resultados cuando ocurriera un error. También cambiamos el mensaje del archivo vacío para que apareciera en español.</w:t>
+            </w:r>
+          </w:p>
+        </w:tc>
+      </w:tr>
+      <w:tr>
+        <w:tc>
+          <w:tcPr>
+            <w:tcW w:w="2400" w:type="dxa"/>
+            <w:tcBorders>
+              <w:top w:val="single" w:sz="4" w:space="0" w:color="BFBFBF"/>
+              <w:left w:val="single" w:sz="4" w:space="0" w:color="BFBFBF"/>
+              <w:bottom w:val="single" w:sz="4" w:space="0" w:color="BFBFBF"/>
+              <w:right w:val="single" w:sz="4" w:space="0" w:color="BFBFBF"/>
+            </w:tcBorders>
+            <w:shd w:val="clear" w:color="auto" w:fill="EAF0F8"/>
+            <w:tcMar>
+              <w:top w:w="80" w:type="dxa"/>
+              <w:left w:w="120" w:type="dxa"/>
+              <w:bottom w:w="80" w:type="dxa"/>
+              <w:right w:w="120" w:type="dxa"/>
+            </w:tcMar>
+          </w:tcPr>
+          <w:p>
+            <w:r>
+              <w:rPr>
+                <w:b/>
+                <w:bCs/>
+              </w:rPr>
+              <w:t>Qué aprendieron</w:t>
+            </w:r>
+          </w:p>
+        </w:tc>
+        <w:tc>
+          <w:tcPr>
+            <w:tcW w:w="6960" w:type="dxa"/>
+            <w:tcBorders>
+              <w:top w:val="single" w:sz="4" w:space="0" w:color="BFBFBF"/>
+              <w:left w:val="single" w:sz="4" w:space="0" w:color="BFBFBF"/>
+              <w:bottom w:val="single" w:sz="4" w:space="0" w:color="BFBFBF"/>
+              <w:right w:val="single" w:sz="4" w:space="0" w:color="BFBFBF"/>
+            </w:tcBorders>
+            <w:tcMar>
+              <w:top w:w="80" w:type="dxa"/>
+              <w:left w:w="120" w:type="dxa"/>
+              <w:bottom w:w="80" w:type="dxa"/>
+              <w:right w:w="120" w:type="dxa"/>
+            </w:tcMar>
+          </w:tcPr>
+          <w:p>
+            <w:pPr>
+              <w:rPr>
+                <w:lang w:val="es-CR"/>
+              </w:rPr>
+            </w:pPr>
+            <w:r>
+              <w:rPr>
+                <w:lang w:val="es-CR"/>
+              </w:rPr>
+              <w:t>Aprendimos que no basta con mostrar un mensaje cuando algo falla. También debemos evitar que la aplicación muestre información anterior que pueda confundir al usuario. Comprendimos la importancia de probar diferentes casos y no solamente los archivos que funcionan correctamente.</w:t>
+            </w:r>
+          </w:p>
+        </w:tc>
+      </w:tr>
+    </w:tbl>
+    <w:p/>
+    <w:p>
+      <w:pPr>
+        <w:pStyle w:val="Ttulo2"/>
+        <w:spacing w:before="300" w:after="120"/>
+        <w:rPr>
+          <w:b/>
+          <w:bCs/>
+          <w:color w:val="1F3864"/>
+          <w:sz w:val="28"/>
+          <w:szCs w:val="28"/>
+        </w:rPr>
+      </w:pPr>
+      <w:r>
+        <w:rPr>
+          <w:b/>
+          <w:bCs/>
+          <w:color w:val="1F3864"/>
+          <w:sz w:val="28"/>
+          <w:szCs w:val="28"/>
+        </w:rPr>
+        <w:t xml:space="preserve">Entrada </w:t>
+      </w:r>
+      <w:r>
+        <w:rPr>
+          <w:b/>
+          <w:bCs/>
+          <w:color w:val="1F3864"/>
+          <w:sz w:val="28"/>
+          <w:szCs w:val="28"/>
+        </w:rPr>
+        <w:t>6</w:t>
+      </w:r>
+    </w:p>
+    <w:tbl>
+      <w:tblPr>
+        <w:tblW w:w="9360" w:type="dxa"/>
+        <w:tblBorders>
+          <w:top w:val="single" w:sz="4" w:space="0" w:color="auto"/>
+          <w:left w:val="single" w:sz="4" w:space="0" w:color="auto"/>
+          <w:bottom w:val="single" w:sz="4" w:space="0" w:color="auto"/>
+          <w:right w:val="single" w:sz="4" w:space="0" w:color="auto"/>
+          <w:insideH w:val="single" w:sz="4" w:space="0" w:color="auto"/>
+          <w:insideV w:val="single" w:sz="4" w:space="0" w:color="auto"/>
+        </w:tblBorders>
+        <w:tblCellMar>
+          <w:left w:w="10" w:type="dxa"/>
+          <w:right w:w="10" w:type="dxa"/>
+        </w:tblCellMar>
+        <w:tblLook w:val="0000" w:firstRow="0" w:lastRow="0" w:firstColumn="0" w:lastColumn="0" w:noHBand="0" w:noVBand="0"/>
+      </w:tblPr>
+      <w:tblGrid>
+        <w:gridCol w:w="2400"/>
+        <w:gridCol w:w="6960"/>
+      </w:tblGrid>
+      <w:tr>
+        <w:tc>
+          <w:tcPr>
+            <w:tcW w:w="2400" w:type="dxa"/>
+            <w:tcBorders>
+              <w:top w:val="single" w:sz="4" w:space="0" w:color="BFBFBF"/>
+              <w:left w:val="single" w:sz="4" w:space="0" w:color="BFBFBF"/>
+              <w:bottom w:val="single" w:sz="4" w:space="0" w:color="BFBFBF"/>
+              <w:right w:val="single" w:sz="4" w:space="0" w:color="BFBFBF"/>
+            </w:tcBorders>
+            <w:shd w:val="clear" w:color="auto" w:fill="EAF0F8"/>
+            <w:tcMar>
+              <w:top w:w="80" w:type="dxa"/>
+              <w:left w:w="120" w:type="dxa"/>
+              <w:bottom w:w="80" w:type="dxa"/>
+              <w:right w:w="120" w:type="dxa"/>
+            </w:tcMar>
+          </w:tcPr>
+          <w:p>
+            <w:r>
+              <w:rPr>
+                <w:b/>
+                <w:bCs/>
+              </w:rPr>
+              <w:t>Fecha</w:t>
+            </w:r>
+          </w:p>
+        </w:tc>
+        <w:tc>
+          <w:tcPr>
+            <w:tcW w:w="6960" w:type="dxa"/>
+            <w:tcBorders>
+              <w:top w:val="single" w:sz="4" w:space="0" w:color="BFBFBF"/>
+              <w:left w:val="single" w:sz="4" w:space="0" w:color="BFBFBF"/>
+              <w:bottom w:val="single" w:sz="4" w:space="0" w:color="BFBFBF"/>
+              <w:right w:val="single" w:sz="4" w:space="0" w:color="BFBFBF"/>
+            </w:tcBorders>
+            <w:tcMar>
+              <w:top w:w="80" w:type="dxa"/>
+              <w:left w:w="120" w:type="dxa"/>
+              <w:bottom w:w="80" w:type="dxa"/>
+              <w:right w:w="120" w:type="dxa"/>
+            </w:tcMar>
+          </w:tcPr>
+          <w:p>
+            <w:pPr>
+              <w:rPr>
+                <w:lang w:val="es-CR"/>
+              </w:rPr>
+            </w:pPr>
+            <w:r>
+              <w:rPr>
+                <w:lang w:val="es-CR"/>
+              </w:rPr>
+              <w:t>23/10/2026</w:t>
+            </w:r>
+          </w:p>
+        </w:tc>
+      </w:tr>
+      <w:tr>
+        <w:tc>
+          <w:tcPr>
+            <w:tcW w:w="2400" w:type="dxa"/>
+            <w:tcBorders>
+              <w:top w:val="single" w:sz="4" w:space="0" w:color="BFBFBF"/>
+              <w:left w:val="single" w:sz="4" w:space="0" w:color="BFBFBF"/>
+              <w:bottom w:val="single" w:sz="4" w:space="0" w:color="BFBFBF"/>
+              <w:right w:val="single" w:sz="4" w:space="0" w:color="BFBFBF"/>
+            </w:tcBorders>
+            <w:shd w:val="clear" w:color="auto" w:fill="EAF0F8"/>
+            <w:tcMar>
+              <w:top w:w="80" w:type="dxa"/>
+              <w:left w:w="120" w:type="dxa"/>
+              <w:bottom w:w="80" w:type="dxa"/>
+              <w:right w:w="120" w:type="dxa"/>
+            </w:tcMar>
+          </w:tcPr>
+          <w:p>
+            <w:r>
+              <w:rPr>
+                <w:b/>
+                <w:bCs/>
+              </w:rPr>
+              <w:lastRenderedPageBreak/>
+              <w:t>Herramienta</w:t>
+            </w:r>
+          </w:p>
+        </w:tc>
+        <w:tc>
+          <w:tcPr>
+            <w:tcW w:w="6960" w:type="dxa"/>
+            <w:tcBorders>
+              <w:top w:val="single" w:sz="4" w:space="0" w:color="BFBFBF"/>
+              <w:left w:val="single" w:sz="4" w:space="0" w:color="BFBFBF"/>
+              <w:bottom w:val="single" w:sz="4" w:space="0" w:color="BFBFBF"/>
+              <w:right w:val="single" w:sz="4" w:space="0" w:color="BFBFBF"/>
+            </w:tcBorders>
+            <w:tcMar>
+              <w:top w:w="80" w:type="dxa"/>
+              <w:left w:w="120" w:type="dxa"/>
+              <w:bottom w:w="80" w:type="dxa"/>
+              <w:right w:w="120" w:type="dxa"/>
+            </w:tcMar>
+          </w:tcPr>
+          <w:p>
+            <w:proofErr w:type="spellStart"/>
+            <w:r>
+              <w:t>ChatGPT</w:t>
+            </w:r>
+            <w:proofErr w:type="spellEnd"/>
+          </w:p>
+        </w:tc>
+      </w:tr>
+      <w:tr>
+        <w:tc>
+          <w:tcPr>
+            <w:tcW w:w="2400" w:type="dxa"/>
+            <w:tcBorders>
+              <w:top w:val="single" w:sz="4" w:space="0" w:color="BFBFBF"/>
+              <w:left w:val="single" w:sz="4" w:space="0" w:color="BFBFBF"/>
+              <w:bottom w:val="single" w:sz="4" w:space="0" w:color="BFBFBF"/>
+              <w:right w:val="single" w:sz="4" w:space="0" w:color="BFBFBF"/>
+            </w:tcBorders>
+            <w:shd w:val="clear" w:color="auto" w:fill="EAF0F8"/>
+            <w:tcMar>
+              <w:top w:w="80" w:type="dxa"/>
+              <w:left w:w="120" w:type="dxa"/>
+              <w:bottom w:w="80" w:type="dxa"/>
+              <w:right w:w="120" w:type="dxa"/>
+            </w:tcMar>
+          </w:tcPr>
+          <w:p>
+            <w:proofErr w:type="spellStart"/>
+            <w:r>
+              <w:rPr>
+                <w:b/>
+                <w:bCs/>
+              </w:rPr>
+              <w:t>Prompt</w:t>
+            </w:r>
+            <w:proofErr w:type="spellEnd"/>
+          </w:p>
+        </w:tc>
+        <w:tc>
+          <w:tcPr>
+            <w:tcW w:w="6960" w:type="dxa"/>
+            <w:tcBorders>
+              <w:top w:val="single" w:sz="4" w:space="0" w:color="BFBFBF"/>
+              <w:left w:val="single" w:sz="4" w:space="0" w:color="BFBFBF"/>
+              <w:bottom w:val="single" w:sz="4" w:space="0" w:color="BFBFBF"/>
+              <w:right w:val="single" w:sz="4" w:space="0" w:color="BFBFBF"/>
+            </w:tcBorders>
+            <w:tcMar>
+              <w:top w:w="80" w:type="dxa"/>
+              <w:left w:w="120" w:type="dxa"/>
+              <w:bottom w:w="80" w:type="dxa"/>
+              <w:right w:w="120" w:type="dxa"/>
+            </w:tcMar>
+          </w:tcPr>
+          <w:p>
+            <w:pPr>
+              <w:rPr>
+                <w:lang w:val="es-CR"/>
+              </w:rPr>
+            </w:pPr>
+            <w:r>
+              <w:rPr>
+                <w:lang w:val="es-CR"/>
+              </w:rPr>
+              <w:t>Ya tenemos la información de nuestro proyecto de ISW-612 sobre memoria y procesos sospechosos. Ahora necesito organizar el documento final en Microsoft Word y aplicar las normas APA 7 que solicita el profesor. No sé muy bien cómo utilizar estas opciones en Word. Quiero que me ayudes paso a paso para configurar los márgenes, la letra, el interlineado, los títulos, las citas, las referencias y las figuras. Explícame dónde debo hacer clic para que yo pueda realizar los cambios correctamente</w:t>
+            </w:r>
+          </w:p>
+        </w:tc>
+      </w:tr>
+      <w:tr>
+        <w:tc>
+          <w:tcPr>
+            <w:tcW w:w="2400" w:type="dxa"/>
+            <w:tcBorders>
+              <w:top w:val="single" w:sz="4" w:space="0" w:color="BFBFBF"/>
+              <w:left w:val="single" w:sz="4" w:space="0" w:color="BFBFBF"/>
+              <w:bottom w:val="single" w:sz="4" w:space="0" w:color="BFBFBF"/>
+              <w:right w:val="single" w:sz="4" w:space="0" w:color="BFBFBF"/>
+            </w:tcBorders>
+            <w:shd w:val="clear" w:color="auto" w:fill="EAF0F8"/>
+            <w:tcMar>
+              <w:top w:w="80" w:type="dxa"/>
+              <w:left w:w="120" w:type="dxa"/>
+              <w:bottom w:w="80" w:type="dxa"/>
+              <w:right w:w="120" w:type="dxa"/>
+            </w:tcMar>
+          </w:tcPr>
+          <w:p>
+            <w:r>
+              <w:rPr>
+                <w:b/>
+                <w:bCs/>
+              </w:rPr>
+              <w:t>Qué devolvió</w:t>
+            </w:r>
+          </w:p>
+        </w:tc>
+        <w:tc>
+          <w:tcPr>
+            <w:tcW w:w="6960" w:type="dxa"/>
+            <w:tcBorders>
+              <w:top w:val="single" w:sz="4" w:space="0" w:color="BFBFBF"/>
+              <w:left w:val="single" w:sz="4" w:space="0" w:color="BFBFBF"/>
+              <w:bottom w:val="single" w:sz="4" w:space="0" w:color="BFBFBF"/>
+              <w:right w:val="single" w:sz="4" w:space="0" w:color="BFBFBF"/>
+            </w:tcBorders>
+            <w:tcMar>
+              <w:top w:w="80" w:type="dxa"/>
+              <w:left w:w="120" w:type="dxa"/>
+              <w:bottom w:w="80" w:type="dxa"/>
+              <w:right w:w="120" w:type="dxa"/>
+            </w:tcMar>
+          </w:tcPr>
+          <w:p>
+            <w:pPr>
+              <w:rPr>
+                <w:lang w:val="es-CR"/>
+              </w:rPr>
+            </w:pPr>
+            <w:proofErr w:type="spellStart"/>
+            <w:r>
+              <w:rPr>
+                <w:lang w:val="es-CR"/>
+              </w:rPr>
+              <w:t>ChatGPT</w:t>
+            </w:r>
+            <w:proofErr w:type="spellEnd"/>
+            <w:r>
+              <w:rPr>
+                <w:lang w:val="es-CR"/>
+              </w:rPr>
+              <w:t xml:space="preserve"> nos explicó cómo organizar el informe académico y aplicar el formato APA 7 en Microsoft Word. Nos orientó con la estructura del documento, los títulos, las citas bibliográficas y la presentación de las imágenes. También nos ayudó a crear un diagrama de arquitectura utilizando SmartArt y a colocar los números, títulos y notas de las figuras.</w:t>
+            </w:r>
+          </w:p>
+        </w:tc>
+      </w:tr>
+      <w:tr>
+        <w:tc>
+          <w:tcPr>
+            <w:tcW w:w="2400" w:type="dxa"/>
+            <w:tcBorders>
+              <w:top w:val="single" w:sz="4" w:space="0" w:color="BFBFBF"/>
+              <w:left w:val="single" w:sz="4" w:space="0" w:color="BFBFBF"/>
+              <w:bottom w:val="single" w:sz="4" w:space="0" w:color="BFBFBF"/>
+              <w:right w:val="single" w:sz="4" w:space="0" w:color="BFBFBF"/>
+            </w:tcBorders>
+            <w:shd w:val="clear" w:color="auto" w:fill="EAF0F8"/>
+            <w:tcMar>
+              <w:top w:w="80" w:type="dxa"/>
+              <w:left w:w="120" w:type="dxa"/>
+              <w:bottom w:w="80" w:type="dxa"/>
+              <w:right w:w="120" w:type="dxa"/>
+            </w:tcMar>
+          </w:tcPr>
+          <w:p>
+            <w:r>
+              <w:rPr>
+                <w:b/>
+                <w:bCs/>
+              </w:rPr>
+              <w:t>Qué verificaron y cómo</w:t>
+            </w:r>
+          </w:p>
+        </w:tc>
+        <w:tc>
+          <w:tcPr>
+            <w:tcW w:w="6960" w:type="dxa"/>
+            <w:tcBorders>
+              <w:top w:val="single" w:sz="4" w:space="0" w:color="BFBFBF"/>
+              <w:left w:val="single" w:sz="4" w:space="0" w:color="BFBFBF"/>
+              <w:bottom w:val="single" w:sz="4" w:space="0" w:color="BFBFBF"/>
+              <w:right w:val="single" w:sz="4" w:space="0" w:color="BFBFBF"/>
+            </w:tcBorders>
+            <w:tcMar>
+              <w:top w:w="80" w:type="dxa"/>
+              <w:left w:w="120" w:type="dxa"/>
+              <w:bottom w:w="80" w:type="dxa"/>
+              <w:right w:w="120" w:type="dxa"/>
+            </w:tcMar>
+          </w:tcPr>
+          <w:p>
+            <w:pPr>
+              <w:rPr>
+                <w:lang w:val="es-CR"/>
+              </w:rPr>
+            </w:pPr>
+            <w:r>
+              <w:rPr>
+                <w:lang w:val="es-CR"/>
+              </w:rPr>
+              <w:t>Abrimos el documento en Microsoft Word y seguimos las instrucciones paso a paso. Revisamos que el informe tuviera las secciones solicitadas por el profesor. También comprobamos la presentación de las siete figuras y organizamos sus títulos y notas siguiendo el formato APA 7.</w:t>
+            </w:r>
+          </w:p>
+        </w:tc>
+      </w:tr>
+      <w:tr>
+        <w:tc>
+          <w:tcPr>
+            <w:tcW w:w="2400" w:type="dxa"/>
+            <w:tcBorders>
+              <w:top w:val="single" w:sz="4" w:space="0" w:color="BFBFBF"/>
+              <w:left w:val="single" w:sz="4" w:space="0" w:color="BFBFBF"/>
+              <w:bottom w:val="single" w:sz="4" w:space="0" w:color="BFBFBF"/>
+              <w:right w:val="single" w:sz="4" w:space="0" w:color="BFBFBF"/>
+            </w:tcBorders>
+            <w:shd w:val="clear" w:color="auto" w:fill="EAF0F8"/>
+            <w:tcMar>
+              <w:top w:w="80" w:type="dxa"/>
+              <w:left w:w="120" w:type="dxa"/>
+              <w:bottom w:w="80" w:type="dxa"/>
+              <w:right w:w="120" w:type="dxa"/>
+            </w:tcMar>
+          </w:tcPr>
+          <w:p>
+            <w:r>
+              <w:rPr>
+                <w:b/>
+                <w:bCs/>
+              </w:rPr>
+              <w:t>Qué corrigieron o descartaron</w:t>
+            </w:r>
+          </w:p>
+        </w:tc>
+        <w:tc>
+          <w:tcPr>
+            <w:tcW w:w="6960" w:type="dxa"/>
+            <w:tcBorders>
+              <w:top w:val="single" w:sz="4" w:space="0" w:color="BFBFBF"/>
+              <w:left w:val="single" w:sz="4" w:space="0" w:color="BFBFBF"/>
+              <w:bottom w:val="single" w:sz="4" w:space="0" w:color="BFBFBF"/>
+              <w:right w:val="single" w:sz="4" w:space="0" w:color="BFBFBF"/>
+            </w:tcBorders>
+            <w:tcMar>
+              <w:top w:w="80" w:type="dxa"/>
+              <w:left w:w="120" w:type="dxa"/>
+              <w:bottom w:w="80" w:type="dxa"/>
+              <w:right w:w="120" w:type="dxa"/>
+            </w:tcMar>
+          </w:tcPr>
+          <w:p>
+            <w:pPr>
+              <w:rPr>
+                <w:lang w:val="es-CR"/>
+              </w:rPr>
+            </w:pPr>
+            <w:r>
+              <w:rPr>
+                <w:lang w:val="es-CR"/>
+              </w:rPr>
+              <w:t>Tuvimos que separar los números y los títulos de las figuras porque inicialmente estaban escritos en una misma línea. También agregamos las notas explicativas debajo de las imágenes y cambiamos la numeración después de incorporar el diagrama de arquitectura como Figura 1. Revisamos algunos párrafos para que fueran más claros y fáciles de comprender.</w:t>
+            </w:r>
+          </w:p>
+        </w:tc>
+      </w:tr>
+      <w:tr>
+        <w:tc>
+          <w:tcPr>
+            <w:tcW w:w="2400" w:type="dxa"/>
+            <w:tcBorders>
+              <w:top w:val="single" w:sz="4" w:space="0" w:color="BFBFBF"/>
+              <w:left w:val="single" w:sz="4" w:space="0" w:color="BFBFBF"/>
+              <w:bottom w:val="single" w:sz="4" w:space="0" w:color="BFBFBF"/>
+              <w:right w:val="single" w:sz="4" w:space="0" w:color="BFBFBF"/>
+            </w:tcBorders>
+            <w:shd w:val="clear" w:color="auto" w:fill="EAF0F8"/>
+            <w:tcMar>
+              <w:top w:w="80" w:type="dxa"/>
+              <w:left w:w="120" w:type="dxa"/>
+              <w:bottom w:w="80" w:type="dxa"/>
+              <w:right w:w="120" w:type="dxa"/>
+            </w:tcMar>
+          </w:tcPr>
+          <w:p>
+            <w:r>
+              <w:rPr>
+                <w:b/>
+                <w:bCs/>
+              </w:rPr>
+              <w:t>Qué aprendieron</w:t>
+            </w:r>
+          </w:p>
+        </w:tc>
+        <w:tc>
+          <w:tcPr>
+            <w:tcW w:w="6960" w:type="dxa"/>
+            <w:tcBorders>
+              <w:top w:val="single" w:sz="4" w:space="0" w:color="BFBFBF"/>
+              <w:left w:val="single" w:sz="4" w:space="0" w:color="BFBFBF"/>
+              <w:bottom w:val="single" w:sz="4" w:space="0" w:color="BFBFBF"/>
+              <w:right w:val="single" w:sz="4" w:space="0" w:color="BFBFBF"/>
+            </w:tcBorders>
+            <w:tcMar>
+              <w:top w:w="80" w:type="dxa"/>
+              <w:left w:w="120" w:type="dxa"/>
+              <w:bottom w:w="80" w:type="dxa"/>
+              <w:right w:w="120" w:type="dxa"/>
+            </w:tcMar>
+          </w:tcPr>
+          <w:p>
+            <w:pPr>
+              <w:rPr>
+                <w:lang w:val="es-CR"/>
+              </w:rPr>
+            </w:pPr>
+            <w:r>
+              <w:rPr>
+                <w:lang w:val="es-CR"/>
+              </w:rPr>
+              <w:t>Aprendimos a utilizar varias herramientas de Microsoft Word y a presentar un documento académico de manera más ordenada. También comprendimos que no es suficiente copiar lo que proporciona la inteligencia artificial. Debemos revisar las indicaciones del profesor y comprobar que el formato sea correcto.</w:t>
+            </w:r>
+          </w:p>
+        </w:tc>
+      </w:tr>
+    </w:tbl>
+    <w:p/>
+    <w:p/>
     <w:p/>
     <w:sectPr>
       <w:pgSz w:w="12240" w:h="15840"/>
@@ -1689,7 +3179,7 @@
 </file>
 
 <file path=word/numbering.xml><?xml version="1.0" encoding="utf-8"?>
-<w:numbering xmlns:wpc="http://schemas.microsoft.com/office/word/2010/wordprocessingCanvas" xmlns:cx="http://schemas.microsoft.com/office/drawing/2014/chartex" xmlns:cx1="http://schemas.microsoft.com/office/drawing/2015/9/8/chartex" xmlns:cx2="http://schemas.microsoft.com/office/drawing/2015/10/21/chartex" xmlns:cx3="http://schemas.microsoft.com/office/drawing/2016/5/9/chartex" xmlns:cx4="http://schemas.microsoft.com/office/drawing/2016/5/10/chartex" xmlns:cx5="http://schemas.microsoft.com/office/drawing/2016/5/11/chartex" xmlns:cx6="http://schemas.microsoft.com/office/drawing/2016/5/12/chartex" xmlns:cx7="http://schemas.microsoft.com/office/drawing/2016/5/13/chartex" xmlns:cx8="http://schemas.microsoft.com/office/drawing/2016/5/14/chartex" xmlns:mc="http://schemas.openxmlformats.org/markup-compatibility/2006" xmlns:aink="http://schemas.microsoft.com/office/drawing/2016/ink" xmlns:am3d="http://schemas.microsoft.com/office/drawing/2017/model3d" xmlns:o="urn:schemas-microsoft-com:office:office" xmlns:r="http://schemas.openxmlformats.org/officeDocument/2006/relationships" xmlns:m="http://schemas.openxmlformats.org/officeDocument/2006/math" xmlns:v="urn:schemas-microsoft-com:vml" xmlns:wp14="http://schemas.microsoft.com/office/word/2010/wordprocessingDrawing" xmlns:wp="http://schemas.openxmlformats.org/drawingml/2006/wordprocessingDrawing" xmlns:w10="urn:schemas-microsoft-com:office:word" xmlns:w="http://schemas.openxmlformats.org/wordprocessingml/2006/main" xmlns:w14="http://schemas.microsoft.com/office/word/2010/wordml" xmlns:w15="http://schemas.microsoft.com/office/word/2012/wordml" xmlns:w16cex="http://schemas.microsoft.com/office/word/2018/wordml/cex" xmlns:w16cid="http://schemas.microsoft.com/office/word/2016/wordml/cid" xmlns:w16="http://schemas.microsoft.com/office/word/2018/wordml" xmlns:w16sdtdh="http://schemas.microsoft.com/office/word/2020/wordml/sdtdatahash" xmlns:w16se="http://schemas.microsoft.com/office/word/2015/wordml/symex" xmlns:wpg="http://schemas.microsoft.com/office/word/2010/wordprocessingGroup" xmlns:wpi="http://schemas.microsoft.com/office/word/2010/wordprocessingInk" xmlns:wne="http://schemas.microsoft.com/office/word/2006/wordml" xmlns:wps="http://schemas.microsoft.com/office/word/2010/wordprocessingShape" mc:Ignorable="w14 w15 w16se w16cid w16 w16cex w16sdtdh wp14">
+<w:numbering xmlns:wpc="http://schemas.microsoft.com/office/word/2010/wordprocessingCanvas" xmlns:cx="http://schemas.microsoft.com/office/drawing/2014/chartex" xmlns:cx1="http://schemas.microsoft.com/office/drawing/2015/9/8/chartex" xmlns:cx2="http://schemas.microsoft.com/office/drawing/2015/10/21/chartex" xmlns:cx3="http://schemas.microsoft.com/office/drawing/2016/5/9/chartex" xmlns:cx4="http://schemas.microsoft.com/office/drawing/2016/5/10/chartex" xmlns:cx5="http://schemas.microsoft.com/office/drawing/2016/5/11/chartex" xmlns:cx6="http://schemas.microsoft.com/office/drawing/2016/5/12/chartex" xmlns:cx7="http://schemas.microsoft.com/office/drawing/2016/5/13/chartex" xmlns:cx8="http://schemas.microsoft.com/office/drawing/2016/5/14/chartex" xmlns:mc="http://schemas.openxmlformats.org/markup-compatibility/2006" xmlns:aink="http://schemas.microsoft.com/office/drawing/2016/ink" xmlns:am3d="http://schemas.microsoft.com/office/drawing/2017/model3d" xmlns:o="urn:schemas-microsoft-com:office:office" xmlns:oel="http://schemas.microsoft.com/office/2019/extlst" xmlns:r="http://schemas.openxmlformats.org/officeDocument/2006/relationships" xmlns:m="http://schemas.openxmlformats.org/officeDocument/2006/math" xmlns:v="urn:schemas-microsoft-com:vml" xmlns:wp14="http://schemas.microsoft.com/office/word/2010/wordprocessingDrawing" xmlns:wp="http://schemas.openxmlformats.org/drawingml/2006/wordprocessingDrawing" xmlns:w10="urn:schemas-microsoft-com:office:word" xmlns:w="http://schemas.openxmlformats.org/wordprocessingml/2006/main" xmlns:w14="http://schemas.microsoft.com/office/word/2010/wordml" xmlns:w15="http://schemas.microsoft.com/office/word/2012/wordml" xmlns:w16cex="http://schemas.microsoft.com/office/word/2018/wordml/cex" xmlns:w16cid="http://schemas.microsoft.com/office/word/2016/wordml/cid" xmlns:w16="http://schemas.microsoft.com/office/word/2018/wordml" xmlns:w16du="http://schemas.microsoft.com/office/word/2023/wordml/word16du" xmlns:w16sdtdh="http://schemas.microsoft.com/office/word/2020/wordml/sdtdatahash" xmlns:w16sdtfl="http://schemas.microsoft.com/office/word/2024/wordml/sdtformatlock" xmlns:w16se="http://schemas.microsoft.com/office/word/2015/wordml/symex" xmlns:wpg="http://schemas.microsoft.com/office/word/2010/wordprocessingGroup" xmlns:wpi="http://schemas.microsoft.com/office/word/2010/wordprocessingInk" xmlns:wne="http://schemas.microsoft.com/office/word/2006/wordml" xmlns:wps="http://schemas.microsoft.com/office/word/2010/wordprocessingShape" mc:Ignorable="w14 w15 w16se w16cid w16 w16cex w16sdtdh w16sdtfl w16du wp14">
   <w:abstractNum w:abstractNumId="0" w15:restartNumberingAfterBreak="0">
     <w:nsid w:val="778D3A96"/>
     <w:multiLevelType w:val="hybridMultilevel"/>
@@ -1776,7 +3266,7 @@
       </w:pPr>
     </w:lvl>
   </w:abstractNum>
-  <w:num w:numId="1">
+  <w:num w:numId="1" w16cid:durableId="497699162">
     <w:abstractNumId w:val="0"/>
     <w:lvlOverride w:ilvl="0">
       <w:startOverride w:val="1"/>
@@ -1786,7 +3276,7 @@
 </file>
 
 <file path=word/styles.xml><?xml version="1.0" encoding="utf-8"?>
-<w:styles xmlns:mc="http://schemas.openxmlformats.org/markup-compatibility/2006" xmlns:r="http://schemas.openxmlformats.org/officeDocument/2006/relationships" xmlns:w="http://schemas.openxmlformats.org/wordprocessingml/2006/main" xmlns:w14="http://schemas.microsoft.com/office/word/2010/wordml" xmlns:w15="http://schemas.microsoft.com/office/word/2012/wordml" xmlns:w16cex="http://schemas.microsoft.com/office/word/2018/wordml/cex" xmlns:w16cid="http://schemas.microsoft.com/office/word/2016/wordml/cid" xmlns:w16="http://schemas.microsoft.com/office/word/2018/wordml" xmlns:w16sdtdh="http://schemas.microsoft.com/office/word/2020/wordml/sdtdatahash" xmlns:w16se="http://schemas.microsoft.com/office/word/2015/wordml/symex" mc:Ignorable="w14 w15 w16se w16cid w16 w16cex w16sdtdh">
+<w:styles xmlns:mc="http://schemas.openxmlformats.org/markup-compatibility/2006" xmlns:r="http://schemas.openxmlformats.org/officeDocument/2006/relationships" xmlns:w="http://schemas.openxmlformats.org/wordprocessingml/2006/main" xmlns:w14="http://schemas.microsoft.com/office/word/2010/wordml" xmlns:w15="http://schemas.microsoft.com/office/word/2012/wordml" xmlns:w16cex="http://schemas.microsoft.com/office/word/2018/wordml/cex" xmlns:w16cid="http://schemas.microsoft.com/office/word/2016/wordml/cid" xmlns:w16="http://schemas.microsoft.com/office/word/2018/wordml" xmlns:w16du="http://schemas.microsoft.com/office/word/2023/wordml/word16du" xmlns:w16sdtdh="http://schemas.microsoft.com/office/word/2020/wordml/sdtdatahash" xmlns:w16sdtfl="http://schemas.microsoft.com/office/word/2024/wordml/sdtformatlock" xmlns:w16se="http://schemas.microsoft.com/office/word/2015/wordml/symex" mc:Ignorable="w14 w15 w16se w16cid w16 w16cex w16sdtdh w16sdtfl w16du">
   <w:docDefaults>
     <w:rPrDefault>
       <w:rPr>
@@ -2266,7 +3756,6 @@
   <w:style w:type="character" w:default="1" w:styleId="Fuentedeprrafopredeter">
     <w:name w:val="Default Paragraph Font"/>
     <w:uiPriority w:val="1"/>
-    <w:semiHidden/>
     <w:unhideWhenUsed/>
   </w:style>
   <w:style w:type="table" w:default="1" w:styleId="Tablanormal">

</xml_diff>